<commit_message>
Ajusta modelos y documentación GR09
</commit_message>
<xml_diff>
--- a/U1/TG.1/1.1. PAO202651_SOAP_JAVA_CONBDD_NRC36884_GR09/01. UML/01. ERS/TALLER_CASOS_DE_USO_EUREKABANK_SOAP_JAVA_GR09.docx
+++ b/U1/TG.1/1.1. PAO202651_SOAP_JAVA_CONBDD_NRC36884_GR09/01. UML/01. ERS/TALLER_CASOS_DE_USO_EUREKABANK_SOAP_JAVA_GR09.docx
@@ -34,24 +34,28 @@
         <w:rPr>
           <w:lang w:val="es"/>
         </w:rPr>
-        <w:t>21 de octubre de 2026</w:t>
+        <w:t>28 de octubre de 2026</w:t>
       </w:r>
     </w:p>
     <w:sdt>
       <w:sdtPr>
         <w:rPr>
-          <w:rFonts w:ascii="Calibri" w:eastAsia="Carlito" w:hAnsi="Calibri" w:cs="Carlito"/>
-          <w:sz w:val="22"/>
-          <w:szCs w:val="22"/>
-          <w:lang w:val="es-ES" w:eastAsia="en-US"/>
-        </w:rPr>
-        <w:id w:val="1359088223"/>
+          <w:rFonts w:eastAsia="Carlito"/>
+        </w:rPr>
+        <w:id w:val="-1245724897"/>
         <w:docPartObj>
           <w:docPartGallery w:val="Table of Contents"/>
           <w:docPartUnique/>
         </w:docPartObj>
       </w:sdtPr>
-      <w:sdtEndPr/>
+      <w:sdtEndPr>
+        <w:rPr>
+          <w:rFonts w:ascii="Calibri" w:hAnsi="Calibri" w:cs="Carlito"/>
+          <w:sz w:val="22"/>
+          <w:szCs w:val="22"/>
+          <w:lang w:val="es-ES" w:eastAsia="en-US"/>
+        </w:rPr>
+      </w:sdtEndPr>
       <w:sdtContent>
         <w:p>
           <w:pPr>
@@ -59,7 +63,7 @@
           </w:pPr>
           <w:r>
             <w:rPr>
-              <w:lang w:val="es"/>
+              <w:rFonts w:eastAsia="Carlito"/>
             </w:rPr>
             <w:t>ÍNDICE DE CONTENIDOS</w:t>
           </w:r>
@@ -87,7 +91,7 @@
           <w:r>
             <w:fldChar w:fldCharType="separate"/>
           </w:r>
-          <w:hyperlink w:anchor="_Toc243510787" w:history="1">
+          <w:hyperlink w:anchor="_Toc244063259" w:history="1">
             <w:r>
               <w:rPr>
                 <w:rStyle w:val="Hipervnculo"/>
@@ -132,7 +136,7 @@
                 <w:noProof/>
                 <w:webHidden/>
               </w:rPr>
-              <w:instrText xml:space="preserve"> PAGEREF _Toc243510787 \h </w:instrText>
+              <w:instrText xml:space="preserve"> PAGEREF _Toc244063259 \h </w:instrText>
             </w:r>
             <w:r>
               <w:rPr>
@@ -177,7 +181,7 @@
               <w:lang w:val="en-US"/>
             </w:rPr>
           </w:pPr>
-          <w:hyperlink w:anchor="_Toc243510788" w:history="1">
+          <w:hyperlink w:anchor="_Toc244063260" w:history="1">
             <w:r>
               <w:rPr>
                 <w:rStyle w:val="Hipervnculo"/>
@@ -222,7 +226,7 @@
                 <w:noProof/>
                 <w:webHidden/>
               </w:rPr>
-              <w:instrText xml:space="preserve"> PAGEREF _Toc243510788 \h </w:instrText>
+              <w:instrText xml:space="preserve"> PAGEREF _Toc244063260 \h </w:instrText>
             </w:r>
             <w:r>
               <w:rPr>
@@ -267,7 +271,7 @@
               <w:lang w:val="en-US"/>
             </w:rPr>
           </w:pPr>
-          <w:hyperlink w:anchor="_Toc243510789" w:history="1">
+          <w:hyperlink w:anchor="_Toc244063261" w:history="1">
             <w:r>
               <w:rPr>
                 <w:rStyle w:val="Hipervnculo"/>
@@ -312,7 +316,7 @@
                 <w:noProof/>
                 <w:webHidden/>
               </w:rPr>
-              <w:instrText xml:space="preserve"> PAGEREF _Toc243510789 \h </w:instrText>
+              <w:instrText xml:space="preserve"> PAGEREF _Toc244063261 \h </w:instrText>
             </w:r>
             <w:r>
               <w:rPr>
@@ -357,7 +361,7 @@
               <w:lang w:val="en-US"/>
             </w:rPr>
           </w:pPr>
-          <w:hyperlink w:anchor="_Toc243510790" w:history="1">
+          <w:hyperlink w:anchor="_Toc244063262" w:history="1">
             <w:r>
               <w:rPr>
                 <w:rStyle w:val="Hipervnculo"/>
@@ -402,7 +406,7 @@
                 <w:noProof/>
                 <w:webHidden/>
               </w:rPr>
-              <w:instrText xml:space="preserve"> PAGEREF _Toc243510790 \h </w:instrText>
+              <w:instrText xml:space="preserve"> PAGEREF _Toc244063262 \h </w:instrText>
             </w:r>
             <w:r>
               <w:rPr>
@@ -447,7 +451,7 @@
               <w:lang w:val="en-US"/>
             </w:rPr>
           </w:pPr>
-          <w:hyperlink w:anchor="_Toc243510791" w:history="1">
+          <w:hyperlink w:anchor="_Toc244063263" w:history="1">
             <w:r>
               <w:rPr>
                 <w:rStyle w:val="Hipervnculo"/>
@@ -492,7 +496,7 @@
                 <w:noProof/>
                 <w:webHidden/>
               </w:rPr>
-              <w:instrText xml:space="preserve"> PAGEREF _Toc243510791 \h </w:instrText>
+              <w:instrText xml:space="preserve"> PAGEREF _Toc244063263 \h </w:instrText>
             </w:r>
             <w:r>
               <w:rPr>
@@ -512,7 +516,7 @@
                 <w:noProof/>
                 <w:webHidden/>
               </w:rPr>
-              <w:t>1</w:t>
+              <w:t>2</w:t>
             </w:r>
             <w:r>
               <w:rPr>
@@ -537,7 +541,7 @@
               <w:lang w:val="en-US"/>
             </w:rPr>
           </w:pPr>
-          <w:hyperlink w:anchor="_Toc243510792" w:history="1">
+          <w:hyperlink w:anchor="_Toc244063264" w:history="1">
             <w:r>
               <w:rPr>
                 <w:rStyle w:val="Hipervnculo"/>
@@ -582,7 +586,7 @@
                 <w:noProof/>
                 <w:webHidden/>
               </w:rPr>
-              <w:instrText xml:space="preserve"> PAGEREF _Toc243510792 \h </w:instrText>
+              <w:instrText xml:space="preserve"> PAGEREF _Toc244063264 \h </w:instrText>
             </w:r>
             <w:r>
               <w:rPr>
@@ -602,7 +606,7 @@
                 <w:noProof/>
                 <w:webHidden/>
               </w:rPr>
-              <w:t>2</w:t>
+              <w:t>3</w:t>
             </w:r>
             <w:r>
               <w:rPr>
@@ -627,7 +631,7 @@
               <w:lang w:val="en-US"/>
             </w:rPr>
           </w:pPr>
-          <w:hyperlink w:anchor="_Toc243510793" w:history="1">
+          <w:hyperlink w:anchor="_Toc244063265" w:history="1">
             <w:r>
               <w:rPr>
                 <w:rStyle w:val="Hipervnculo"/>
@@ -672,7 +676,7 @@
                 <w:noProof/>
                 <w:webHidden/>
               </w:rPr>
-              <w:instrText xml:space="preserve"> PAGEREF _Toc243510793 \h </w:instrText>
+              <w:instrText xml:space="preserve"> PAGEREF _Toc244063265 \h </w:instrText>
             </w:r>
             <w:r>
               <w:rPr>
@@ -717,7 +721,7 @@
               <w:lang w:val="en-US"/>
             </w:rPr>
           </w:pPr>
-          <w:hyperlink w:anchor="_Toc243510794" w:history="1">
+          <w:hyperlink w:anchor="_Toc244063266" w:history="1">
             <w:r>
               <w:rPr>
                 <w:rStyle w:val="Hipervnculo"/>
@@ -762,7 +766,7 @@
                 <w:noProof/>
                 <w:webHidden/>
               </w:rPr>
-              <w:instrText xml:space="preserve"> PAGEREF _Toc243510794 \h </w:instrText>
+              <w:instrText xml:space="preserve"> PAGEREF _Toc244063266 \h </w:instrText>
             </w:r>
             <w:r>
               <w:rPr>
@@ -807,7 +811,7 @@
               <w:lang w:val="en-US"/>
             </w:rPr>
           </w:pPr>
-          <w:hyperlink w:anchor="_Toc243510795" w:history="1">
+          <w:hyperlink w:anchor="_Toc244063267" w:history="1">
             <w:r>
               <w:rPr>
                 <w:rStyle w:val="Hipervnculo"/>
@@ -852,7 +856,7 @@
                 <w:noProof/>
                 <w:webHidden/>
               </w:rPr>
-              <w:instrText xml:space="preserve"> PAGEREF _Toc243510795 \h </w:instrText>
+              <w:instrText xml:space="preserve"> PAGEREF _Toc244063267 \h </w:instrText>
             </w:r>
             <w:r>
               <w:rPr>
@@ -872,7 +876,7 @@
                 <w:noProof/>
                 <w:webHidden/>
               </w:rPr>
-              <w:t>3</w:t>
+              <w:t>4</w:t>
             </w:r>
             <w:r>
               <w:rPr>
@@ -897,7 +901,7 @@
               <w:lang w:val="en-US"/>
             </w:rPr>
           </w:pPr>
-          <w:hyperlink w:anchor="_Toc243510796" w:history="1">
+          <w:hyperlink w:anchor="_Toc244063268" w:history="1">
             <w:r>
               <w:rPr>
                 <w:rStyle w:val="Hipervnculo"/>
@@ -942,7 +946,7 @@
                 <w:noProof/>
                 <w:webHidden/>
               </w:rPr>
-              <w:instrText xml:space="preserve"> PAGEREF _Toc243510796 \h </w:instrText>
+              <w:instrText xml:space="preserve"> PAGEREF _Toc244063268 \h </w:instrText>
             </w:r>
             <w:r>
               <w:rPr>
@@ -962,7 +966,97 @@
                 <w:noProof/>
                 <w:webHidden/>
               </w:rPr>
-              <w:t>3</w:t>
+              <w:t>4</w:t>
+            </w:r>
+            <w:r>
+              <w:rPr>
+                <w:noProof/>
+                <w:webHidden/>
+              </w:rPr>
+              <w:fldChar w:fldCharType="end"/>
+            </w:r>
+          </w:hyperlink>
+        </w:p>
+        <w:p>
+          <w:pPr>
+            <w:pStyle w:val="TDC2"/>
+            <w:tabs>
+              <w:tab w:val="left" w:pos="1421"/>
+              <w:tab w:val="right" w:leader="dot" w:pos="8494"/>
+            </w:tabs>
+            <w:rPr>
+              <w:rFonts w:asciiTheme="minorHAnsi" w:eastAsiaTheme="minorEastAsia" w:hAnsiTheme="minorHAnsi" w:cstheme="minorBidi"/>
+              <w:noProof/>
+              <w:color w:val="auto"/>
+              <w:lang w:val="en-US"/>
+            </w:rPr>
+          </w:pPr>
+          <w:hyperlink w:anchor="_Toc244063269" w:history="1">
+            <w:r>
+              <w:rPr>
+                <w:rStyle w:val="Hipervnculo"/>
+                <w:noProof/>
+                <w:lang w:val="es"/>
+              </w:rPr>
+              <w:t>5.2</w:t>
+            </w:r>
+            <w:r>
+              <w:rPr>
+                <w:rFonts w:asciiTheme="minorHAnsi" w:eastAsiaTheme="minorEastAsia" w:hAnsiTheme="minorHAnsi" w:cstheme="minorBidi"/>
+                <w:noProof/>
+                <w:color w:val="auto"/>
+                <w:lang w:val="en-US"/>
+              </w:rPr>
+              <w:tab/>
+            </w:r>
+            <w:r>
+              <w:rPr>
+                <w:rStyle w:val="Hipervnculo"/>
+                <w:noProof/>
+                <w:lang w:val="es"/>
+              </w:rPr>
+              <w:t>CU-02 — Consultar cuentas</w:t>
+            </w:r>
+            <w:r>
+              <w:rPr>
+                <w:noProof/>
+                <w:webHidden/>
+              </w:rPr>
+              <w:tab/>
+            </w:r>
+            <w:r>
+              <w:rPr>
+                <w:noProof/>
+                <w:webHidden/>
+              </w:rPr>
+              <w:fldChar w:fldCharType="begin"/>
+            </w:r>
+            <w:r>
+              <w:rPr>
+                <w:noProof/>
+                <w:webHidden/>
+              </w:rPr>
+              <w:instrText xml:space="preserve"> PAGEREF _Toc244063269 \h </w:instrText>
+            </w:r>
+            <w:r>
+              <w:rPr>
+                <w:noProof/>
+                <w:webHidden/>
+              </w:rPr>
+            </w:r>
+            <w:r>
+              <w:rPr>
+                <w:noProof/>
+                <w:webHidden/>
+              </w:rPr>
+              <w:fldChar w:fldCharType="separate"/>
+            </w:r>
+            <w:r>
+              <w:rPr>
+                <w:noProof/>
+                <w:webHidden/>
+              </w:rPr>
+              <w:t>4</w:t>
             </w:r>
             <w:r>
               <w:rPr>
@@ -987,14 +1081,14 @@
               <w:lang w:val="en-US"/>
             </w:rPr>
           </w:pPr>
-          <w:hyperlink w:anchor="_Toc243510797" w:history="1">
+          <w:hyperlink w:anchor="_Toc244063270" w:history="1">
             <w:r>
               <w:rPr>
                 <w:rStyle w:val="Hipervnculo"/>
                 <w:noProof/>
                 <w:lang w:val="es"/>
               </w:rPr>
-              <w:t>5.1.3</w:t>
+              <w:t>5.2.1</w:t>
             </w:r>
             <w:r>
               <w:rPr>
@@ -1011,7 +1105,7 @@
                 <w:noProof/>
                 <w:lang w:val="es"/>
               </w:rPr>
-              <w:t>Variación por cliente</w:t>
+              <w:t>Flujo principal</w:t>
             </w:r>
             <w:r>
               <w:rPr>
@@ -1032,7 +1126,7 @@
                 <w:noProof/>
                 <w:webHidden/>
               </w:rPr>
-              <w:instrText xml:space="preserve"> PAGEREF _Toc243510797 \h </w:instrText>
+              <w:instrText xml:space="preserve"> PAGEREF _Toc244063270 \h </w:instrText>
             </w:r>
             <w:r>
               <w:rPr>
@@ -1052,7 +1146,97 @@
                 <w:noProof/>
                 <w:webHidden/>
               </w:rPr>
-              <w:t>3</w:t>
+              <w:t>4</w:t>
+            </w:r>
+            <w:r>
+              <w:rPr>
+                <w:noProof/>
+                <w:webHidden/>
+              </w:rPr>
+              <w:fldChar w:fldCharType="end"/>
+            </w:r>
+          </w:hyperlink>
+        </w:p>
+        <w:p>
+          <w:pPr>
+            <w:pStyle w:val="TDC3"/>
+            <w:tabs>
+              <w:tab w:val="left" w:pos="1861"/>
+              <w:tab w:val="right" w:leader="dot" w:pos="8494"/>
+            </w:tabs>
+            <w:rPr>
+              <w:rFonts w:asciiTheme="minorHAnsi" w:eastAsiaTheme="minorEastAsia" w:hAnsiTheme="minorHAnsi" w:cstheme="minorBidi"/>
+              <w:noProof/>
+              <w:color w:val="auto"/>
+              <w:lang w:val="en-US"/>
+            </w:rPr>
+          </w:pPr>
+          <w:hyperlink w:anchor="_Toc244063271" w:history="1">
+            <w:r>
+              <w:rPr>
+                <w:rStyle w:val="Hipervnculo"/>
+                <w:noProof/>
+                <w:lang w:val="es"/>
+              </w:rPr>
+              <w:t>5.2.2</w:t>
+            </w:r>
+            <w:r>
+              <w:rPr>
+                <w:rFonts w:asciiTheme="minorHAnsi" w:eastAsiaTheme="minorEastAsia" w:hAnsiTheme="minorHAnsi" w:cstheme="minorBidi"/>
+                <w:noProof/>
+                <w:color w:val="auto"/>
+                <w:lang w:val="en-US"/>
+              </w:rPr>
+              <w:tab/>
+            </w:r>
+            <w:r>
+              <w:rPr>
+                <w:rStyle w:val="Hipervnculo"/>
+                <w:noProof/>
+                <w:lang w:val="es"/>
+              </w:rPr>
+              <w:t>Flujos alternativos y excepciones</w:t>
+            </w:r>
+            <w:r>
+              <w:rPr>
+                <w:noProof/>
+                <w:webHidden/>
+              </w:rPr>
+              <w:tab/>
+            </w:r>
+            <w:r>
+              <w:rPr>
+                <w:noProof/>
+                <w:webHidden/>
+              </w:rPr>
+              <w:fldChar w:fldCharType="begin"/>
+            </w:r>
+            <w:r>
+              <w:rPr>
+                <w:noProof/>
+                <w:webHidden/>
+              </w:rPr>
+              <w:instrText xml:space="preserve"> PAGEREF _Toc244063271 \h </w:instrText>
+            </w:r>
+            <w:r>
+              <w:rPr>
+                <w:noProof/>
+                <w:webHidden/>
+              </w:rPr>
+            </w:r>
+            <w:r>
+              <w:rPr>
+                <w:noProof/>
+                <w:webHidden/>
+              </w:rPr>
+              <w:fldChar w:fldCharType="separate"/>
+            </w:r>
+            <w:r>
+              <w:rPr>
+                <w:noProof/>
+                <w:webHidden/>
+              </w:rPr>
+              <w:t>5</w:t>
             </w:r>
             <w:r>
               <w:rPr>
@@ -1077,14 +1261,14 @@
               <w:lang w:val="en-US"/>
             </w:rPr>
           </w:pPr>
-          <w:hyperlink w:anchor="_Toc243510798" w:history="1">
+          <w:hyperlink w:anchor="_Toc244063272" w:history="1">
             <w:r>
               <w:rPr>
                 <w:rStyle w:val="Hipervnculo"/>
                 <w:noProof/>
                 <w:lang w:val="es"/>
               </w:rPr>
-              <w:t>5.2</w:t>
+              <w:t>5.3</w:t>
             </w:r>
             <w:r>
               <w:rPr>
@@ -1101,7 +1285,7 @@
                 <w:noProof/>
                 <w:lang w:val="es"/>
               </w:rPr>
-              <w:t>CU-02 — Consultar movimientos</w:t>
+              <w:t>CU-03 — Consultar movimientos</w:t>
             </w:r>
             <w:r>
               <w:rPr>
@@ -1122,7 +1306,7 @@
                 <w:noProof/>
                 <w:webHidden/>
               </w:rPr>
-              <w:instrText xml:space="preserve"> PAGEREF _Toc243510798 \h </w:instrText>
+              <w:instrText xml:space="preserve"> PAGEREF _Toc244063272 \h </w:instrText>
             </w:r>
             <w:r>
               <w:rPr>
@@ -1142,7 +1326,7 @@
                 <w:noProof/>
                 <w:webHidden/>
               </w:rPr>
-              <w:t>3</w:t>
+              <w:t>5</w:t>
             </w:r>
             <w:r>
               <w:rPr>
@@ -1167,14 +1351,14 @@
               <w:lang w:val="en-US"/>
             </w:rPr>
           </w:pPr>
-          <w:hyperlink w:anchor="_Toc243510799" w:history="1">
+          <w:hyperlink w:anchor="_Toc244063273" w:history="1">
             <w:r>
               <w:rPr>
                 <w:rStyle w:val="Hipervnculo"/>
                 <w:noProof/>
                 <w:lang w:val="es"/>
               </w:rPr>
-              <w:t>5.2.1</w:t>
+              <w:t>5.3.1</w:t>
             </w:r>
             <w:r>
               <w:rPr>
@@ -1212,7 +1396,7 @@
                 <w:noProof/>
                 <w:webHidden/>
               </w:rPr>
-              <w:instrText xml:space="preserve"> PAGEREF _Toc243510799 \h </w:instrText>
+              <w:instrText xml:space="preserve"> PAGEREF _Toc244063273 \h </w:instrText>
             </w:r>
             <w:r>
               <w:rPr>
@@ -1232,7 +1416,7 @@
                 <w:noProof/>
                 <w:webHidden/>
               </w:rPr>
-              <w:t>4</w:t>
+              <w:t>5</w:t>
             </w:r>
             <w:r>
               <w:rPr>
@@ -1257,14 +1441,14 @@
               <w:lang w:val="en-US"/>
             </w:rPr>
           </w:pPr>
-          <w:hyperlink w:anchor="_Toc243510800" w:history="1">
+          <w:hyperlink w:anchor="_Toc244063274" w:history="1">
             <w:r>
               <w:rPr>
                 <w:rStyle w:val="Hipervnculo"/>
                 <w:noProof/>
                 <w:lang w:val="es"/>
               </w:rPr>
-              <w:t>5.2.2</w:t>
+              <w:t>5.3.2</w:t>
             </w:r>
             <w:r>
               <w:rPr>
@@ -1302,7 +1486,7 @@
                 <w:noProof/>
                 <w:webHidden/>
               </w:rPr>
-              <w:instrText xml:space="preserve"> PAGEREF _Toc243510800 \h </w:instrText>
+              <w:instrText xml:space="preserve"> PAGEREF _Toc244063274 \h </w:instrText>
             </w:r>
             <w:r>
               <w:rPr>
@@ -1322,7 +1506,97 @@
                 <w:noProof/>
                 <w:webHidden/>
               </w:rPr>
-              <w:t>4</w:t>
+              <w:t>5</w:t>
+            </w:r>
+            <w:r>
+              <w:rPr>
+                <w:noProof/>
+                <w:webHidden/>
+              </w:rPr>
+              <w:fldChar w:fldCharType="end"/>
+            </w:r>
+          </w:hyperlink>
+        </w:p>
+        <w:p>
+          <w:pPr>
+            <w:pStyle w:val="TDC2"/>
+            <w:tabs>
+              <w:tab w:val="left" w:pos="1421"/>
+              <w:tab w:val="right" w:leader="dot" w:pos="8494"/>
+            </w:tabs>
+            <w:rPr>
+              <w:rFonts w:asciiTheme="minorHAnsi" w:eastAsiaTheme="minorEastAsia" w:hAnsiTheme="minorHAnsi" w:cstheme="minorBidi"/>
+              <w:noProof/>
+              <w:color w:val="auto"/>
+              <w:lang w:val="en-US"/>
+            </w:rPr>
+          </w:pPr>
+          <w:hyperlink w:anchor="_Toc244063275" w:history="1">
+            <w:r>
+              <w:rPr>
+                <w:rStyle w:val="Hipervnculo"/>
+                <w:noProof/>
+                <w:lang w:val="es"/>
+              </w:rPr>
+              <w:t>5.4</w:t>
+            </w:r>
+            <w:r>
+              <w:rPr>
+                <w:rFonts w:asciiTheme="minorHAnsi" w:eastAsiaTheme="minorEastAsia" w:hAnsiTheme="minorHAnsi" w:cstheme="minorBidi"/>
+                <w:noProof/>
+                <w:color w:val="auto"/>
+                <w:lang w:val="en-US"/>
+              </w:rPr>
+              <w:tab/>
+            </w:r>
+            <w:r>
+              <w:rPr>
+                <w:rStyle w:val="Hipervnculo"/>
+                <w:noProof/>
+                <w:lang w:val="es"/>
+              </w:rPr>
+              <w:t>CU-04 — Registrar depósito</w:t>
+            </w:r>
+            <w:r>
+              <w:rPr>
+                <w:noProof/>
+                <w:webHidden/>
+              </w:rPr>
+              <w:tab/>
+            </w:r>
+            <w:r>
+              <w:rPr>
+                <w:noProof/>
+                <w:webHidden/>
+              </w:rPr>
+              <w:fldChar w:fldCharType="begin"/>
+            </w:r>
+            <w:r>
+              <w:rPr>
+                <w:noProof/>
+                <w:webHidden/>
+              </w:rPr>
+              <w:instrText xml:space="preserve"> PAGEREF _Toc244063275 \h </w:instrText>
+            </w:r>
+            <w:r>
+              <w:rPr>
+                <w:noProof/>
+                <w:webHidden/>
+              </w:rPr>
+            </w:r>
+            <w:r>
+              <w:rPr>
+                <w:noProof/>
+                <w:webHidden/>
+              </w:rPr>
+              <w:fldChar w:fldCharType="separate"/>
+            </w:r>
+            <w:r>
+              <w:rPr>
+                <w:noProof/>
+                <w:webHidden/>
+              </w:rPr>
+              <w:t>5</w:t>
             </w:r>
             <w:r>
               <w:rPr>
@@ -1347,14 +1621,14 @@
               <w:lang w:val="en-US"/>
             </w:rPr>
           </w:pPr>
-          <w:hyperlink w:anchor="_Toc243510801" w:history="1">
+          <w:hyperlink w:anchor="_Toc244063276" w:history="1">
             <w:r>
               <w:rPr>
                 <w:rStyle w:val="Hipervnculo"/>
                 <w:noProof/>
                 <w:lang w:val="es"/>
               </w:rPr>
-              <w:t>5.2.3</w:t>
+              <w:t>5.4.1</w:t>
             </w:r>
             <w:r>
               <w:rPr>
@@ -1371,7 +1645,7 @@
                 <w:noProof/>
                 <w:lang w:val="es"/>
               </w:rPr>
-              <w:t>Datos de salida</w:t>
+              <w:t>Flujo principal</w:t>
             </w:r>
             <w:r>
               <w:rPr>
@@ -1392,7 +1666,7 @@
                 <w:noProof/>
                 <w:webHidden/>
               </w:rPr>
-              <w:instrText xml:space="preserve"> PAGEREF _Toc243510801 \h </w:instrText>
+              <w:instrText xml:space="preserve"> PAGEREF _Toc244063276 \h </w:instrText>
             </w:r>
             <w:r>
               <w:rPr>
@@ -1412,7 +1686,97 @@
                 <w:noProof/>
                 <w:webHidden/>
               </w:rPr>
-              <w:t>4</w:t>
+              <w:t>6</w:t>
+            </w:r>
+            <w:r>
+              <w:rPr>
+                <w:noProof/>
+                <w:webHidden/>
+              </w:rPr>
+              <w:fldChar w:fldCharType="end"/>
+            </w:r>
+          </w:hyperlink>
+        </w:p>
+        <w:p>
+          <w:pPr>
+            <w:pStyle w:val="TDC3"/>
+            <w:tabs>
+              <w:tab w:val="left" w:pos="1861"/>
+              <w:tab w:val="right" w:leader="dot" w:pos="8494"/>
+            </w:tabs>
+            <w:rPr>
+              <w:rFonts w:asciiTheme="minorHAnsi" w:eastAsiaTheme="minorEastAsia" w:hAnsiTheme="minorHAnsi" w:cstheme="minorBidi"/>
+              <w:noProof/>
+              <w:color w:val="auto"/>
+              <w:lang w:val="en-US"/>
+            </w:rPr>
+          </w:pPr>
+          <w:hyperlink w:anchor="_Toc244063277" w:history="1">
+            <w:r>
+              <w:rPr>
+                <w:rStyle w:val="Hipervnculo"/>
+                <w:noProof/>
+                <w:lang w:val="es"/>
+              </w:rPr>
+              <w:t>5.4.2</w:t>
+            </w:r>
+            <w:r>
+              <w:rPr>
+                <w:rFonts w:asciiTheme="minorHAnsi" w:eastAsiaTheme="minorEastAsia" w:hAnsiTheme="minorHAnsi" w:cstheme="minorBidi"/>
+                <w:noProof/>
+                <w:color w:val="auto"/>
+                <w:lang w:val="en-US"/>
+              </w:rPr>
+              <w:tab/>
+            </w:r>
+            <w:r>
+              <w:rPr>
+                <w:rStyle w:val="Hipervnculo"/>
+                <w:noProof/>
+                <w:lang w:val="es"/>
+              </w:rPr>
+              <w:t>Flujos alternativos y excepciones</w:t>
+            </w:r>
+            <w:r>
+              <w:rPr>
+                <w:noProof/>
+                <w:webHidden/>
+              </w:rPr>
+              <w:tab/>
+            </w:r>
+            <w:r>
+              <w:rPr>
+                <w:noProof/>
+                <w:webHidden/>
+              </w:rPr>
+              <w:fldChar w:fldCharType="begin"/>
+            </w:r>
+            <w:r>
+              <w:rPr>
+                <w:noProof/>
+                <w:webHidden/>
+              </w:rPr>
+              <w:instrText xml:space="preserve"> PAGEREF _Toc244063277 \h </w:instrText>
+            </w:r>
+            <w:r>
+              <w:rPr>
+                <w:noProof/>
+                <w:webHidden/>
+              </w:rPr>
+            </w:r>
+            <w:r>
+              <w:rPr>
+                <w:noProof/>
+                <w:webHidden/>
+              </w:rPr>
+              <w:fldChar w:fldCharType="separate"/>
+            </w:r>
+            <w:r>
+              <w:rPr>
+                <w:noProof/>
+                <w:webHidden/>
+              </w:rPr>
+              <w:t>6</w:t>
             </w:r>
             <w:r>
               <w:rPr>
@@ -1437,14 +1801,14 @@
               <w:lang w:val="en-US"/>
             </w:rPr>
           </w:pPr>
-          <w:hyperlink w:anchor="_Toc243510802" w:history="1">
+          <w:hyperlink w:anchor="_Toc244063278" w:history="1">
             <w:r>
               <w:rPr>
                 <w:rStyle w:val="Hipervnculo"/>
                 <w:noProof/>
                 <w:lang w:val="es"/>
               </w:rPr>
-              <w:t>5.3</w:t>
+              <w:t>5.5</w:t>
             </w:r>
             <w:r>
               <w:rPr>
@@ -1461,7 +1825,7 @@
                 <w:noProof/>
                 <w:lang w:val="es"/>
               </w:rPr>
-              <w:t>CU-03 — Registrar depósito</w:t>
+              <w:t>CU-05 — Transferir fondos</w:t>
             </w:r>
             <w:r>
               <w:rPr>
@@ -1482,7 +1846,7 @@
                 <w:noProof/>
                 <w:webHidden/>
               </w:rPr>
-              <w:instrText xml:space="preserve"> PAGEREF _Toc243510802 \h </w:instrText>
+              <w:instrText xml:space="preserve"> PAGEREF _Toc244063278 \h </w:instrText>
             </w:r>
             <w:r>
               <w:rPr>
@@ -1502,7 +1866,7 @@
                 <w:noProof/>
                 <w:webHidden/>
               </w:rPr>
-              <w:t>5</w:t>
+              <w:t>6</w:t>
             </w:r>
             <w:r>
               <w:rPr>
@@ -1527,14 +1891,14 @@
               <w:lang w:val="en-US"/>
             </w:rPr>
           </w:pPr>
-          <w:hyperlink w:anchor="_Toc243510803" w:history="1">
+          <w:hyperlink w:anchor="_Toc244063279" w:history="1">
             <w:r>
               <w:rPr>
                 <w:rStyle w:val="Hipervnculo"/>
                 <w:noProof/>
                 <w:lang w:val="es"/>
               </w:rPr>
-              <w:t>5.3.1</w:t>
+              <w:t>5.5.1</w:t>
             </w:r>
             <w:r>
               <w:rPr>
@@ -1572,7 +1936,7 @@
                 <w:noProof/>
                 <w:webHidden/>
               </w:rPr>
-              <w:instrText xml:space="preserve"> PAGEREF _Toc243510803 \h </w:instrText>
+              <w:instrText xml:space="preserve"> PAGEREF _Toc244063279 \h </w:instrText>
             </w:r>
             <w:r>
               <w:rPr>
@@ -1592,7 +1956,7 @@
                 <w:noProof/>
                 <w:webHidden/>
               </w:rPr>
-              <w:t>5</w:t>
+              <w:t>7</w:t>
             </w:r>
             <w:r>
               <w:rPr>
@@ -1617,14 +1981,14 @@
               <w:lang w:val="en-US"/>
             </w:rPr>
           </w:pPr>
-          <w:hyperlink w:anchor="_Toc243510804" w:history="1">
+          <w:hyperlink w:anchor="_Toc244063280" w:history="1">
             <w:r>
               <w:rPr>
                 <w:rStyle w:val="Hipervnculo"/>
                 <w:noProof/>
                 <w:lang w:val="es"/>
               </w:rPr>
-              <w:t>5.3.2</w:t>
+              <w:t>5.5.2</w:t>
             </w:r>
             <w:r>
               <w:rPr>
@@ -1662,7 +2026,7 @@
                 <w:noProof/>
                 <w:webHidden/>
               </w:rPr>
-              <w:instrText xml:space="preserve"> PAGEREF _Toc243510804 \h </w:instrText>
+              <w:instrText xml:space="preserve"> PAGEREF _Toc244063280 \h </w:instrText>
             </w:r>
             <w:r>
               <w:rPr>
@@ -1682,7 +2046,97 @@
                 <w:noProof/>
                 <w:webHidden/>
               </w:rPr>
-              <w:t>5</w:t>
+              <w:t>7</w:t>
+            </w:r>
+            <w:r>
+              <w:rPr>
+                <w:noProof/>
+                <w:webHidden/>
+              </w:rPr>
+              <w:fldChar w:fldCharType="end"/>
+            </w:r>
+          </w:hyperlink>
+        </w:p>
+        <w:p>
+          <w:pPr>
+            <w:pStyle w:val="TDC2"/>
+            <w:tabs>
+              <w:tab w:val="left" w:pos="1421"/>
+              <w:tab w:val="right" w:leader="dot" w:pos="8494"/>
+            </w:tabs>
+            <w:rPr>
+              <w:rFonts w:asciiTheme="minorHAnsi" w:eastAsiaTheme="minorEastAsia" w:hAnsiTheme="minorHAnsi" w:cstheme="minorBidi"/>
+              <w:noProof/>
+              <w:color w:val="auto"/>
+              <w:lang w:val="en-US"/>
+            </w:rPr>
+          </w:pPr>
+          <w:hyperlink w:anchor="_Toc244063281" w:history="1">
+            <w:r>
+              <w:rPr>
+                <w:rStyle w:val="Hipervnculo"/>
+                <w:noProof/>
+                <w:lang w:val="es"/>
+              </w:rPr>
+              <w:t>5.6</w:t>
+            </w:r>
+            <w:r>
+              <w:rPr>
+                <w:rFonts w:asciiTheme="minorHAnsi" w:eastAsiaTheme="minorEastAsia" w:hAnsiTheme="minorHAnsi" w:cstheme="minorBidi"/>
+                <w:noProof/>
+                <w:color w:val="auto"/>
+                <w:lang w:val="en-US"/>
+              </w:rPr>
+              <w:tab/>
+            </w:r>
+            <w:r>
+              <w:rPr>
+                <w:rStyle w:val="Hipervnculo"/>
+                <w:noProof/>
+                <w:lang w:val="es"/>
+              </w:rPr>
+              <w:t>CU-06 — Cerrar sesión</w:t>
+            </w:r>
+            <w:r>
+              <w:rPr>
+                <w:noProof/>
+                <w:webHidden/>
+              </w:rPr>
+              <w:tab/>
+            </w:r>
+            <w:r>
+              <w:rPr>
+                <w:noProof/>
+                <w:webHidden/>
+              </w:rPr>
+              <w:fldChar w:fldCharType="begin"/>
+            </w:r>
+            <w:r>
+              <w:rPr>
+                <w:noProof/>
+                <w:webHidden/>
+              </w:rPr>
+              <w:instrText xml:space="preserve"> PAGEREF _Toc244063281 \h </w:instrText>
+            </w:r>
+            <w:r>
+              <w:rPr>
+                <w:noProof/>
+                <w:webHidden/>
+              </w:rPr>
+            </w:r>
+            <w:r>
+              <w:rPr>
+                <w:noProof/>
+                <w:webHidden/>
+              </w:rPr>
+              <w:fldChar w:fldCharType="separate"/>
+            </w:r>
+            <w:r>
+              <w:rPr>
+                <w:noProof/>
+                <w:webHidden/>
+              </w:rPr>
+              <w:t>7</w:t>
             </w:r>
             <w:r>
               <w:rPr>
@@ -1707,14 +2161,14 @@
               <w:lang w:val="en-US"/>
             </w:rPr>
           </w:pPr>
-          <w:hyperlink w:anchor="_Toc243510805" w:history="1">
+          <w:hyperlink w:anchor="_Toc244063282" w:history="1">
             <w:r>
               <w:rPr>
                 <w:rStyle w:val="Hipervnculo"/>
                 <w:noProof/>
                 <w:lang w:val="es"/>
               </w:rPr>
-              <w:t>5.3.3</w:t>
+              <w:t>5.6.1</w:t>
             </w:r>
             <w:r>
               <w:rPr>
@@ -1731,7 +2185,7 @@
                 <w:noProof/>
                 <w:lang w:val="es"/>
               </w:rPr>
-              <w:t>Variación por cliente</w:t>
+              <w:t>Flujo principal</w:t>
             </w:r>
             <w:r>
               <w:rPr>
@@ -1752,7 +2206,7 @@
                 <w:noProof/>
                 <w:webHidden/>
               </w:rPr>
-              <w:instrText xml:space="preserve"> PAGEREF _Toc243510805 \h </w:instrText>
+              <w:instrText xml:space="preserve"> PAGEREF _Toc244063282 \h </w:instrText>
             </w:r>
             <w:r>
               <w:rPr>
@@ -1772,7 +2226,97 @@
                 <w:noProof/>
                 <w:webHidden/>
               </w:rPr>
-              <w:t>5</w:t>
+              <w:t>8</w:t>
+            </w:r>
+            <w:r>
+              <w:rPr>
+                <w:noProof/>
+                <w:webHidden/>
+              </w:rPr>
+              <w:fldChar w:fldCharType="end"/>
+            </w:r>
+          </w:hyperlink>
+        </w:p>
+        <w:p>
+          <w:pPr>
+            <w:pStyle w:val="TDC3"/>
+            <w:tabs>
+              <w:tab w:val="left" w:pos="1861"/>
+              <w:tab w:val="right" w:leader="dot" w:pos="8494"/>
+            </w:tabs>
+            <w:rPr>
+              <w:rFonts w:asciiTheme="minorHAnsi" w:eastAsiaTheme="minorEastAsia" w:hAnsiTheme="minorHAnsi" w:cstheme="minorBidi"/>
+              <w:noProof/>
+              <w:color w:val="auto"/>
+              <w:lang w:val="en-US"/>
+            </w:rPr>
+          </w:pPr>
+          <w:hyperlink w:anchor="_Toc244063283" w:history="1">
+            <w:r>
+              <w:rPr>
+                <w:rStyle w:val="Hipervnculo"/>
+                <w:noProof/>
+                <w:lang w:val="es"/>
+              </w:rPr>
+              <w:t>5.6.2</w:t>
+            </w:r>
+            <w:r>
+              <w:rPr>
+                <w:rFonts w:asciiTheme="minorHAnsi" w:eastAsiaTheme="minorEastAsia" w:hAnsiTheme="minorHAnsi" w:cstheme="minorBidi"/>
+                <w:noProof/>
+                <w:color w:val="auto"/>
+                <w:lang w:val="en-US"/>
+              </w:rPr>
+              <w:tab/>
+            </w:r>
+            <w:r>
+              <w:rPr>
+                <w:rStyle w:val="Hipervnculo"/>
+                <w:noProof/>
+                <w:lang w:val="es"/>
+              </w:rPr>
+              <w:t>Flujos alternativos y excepciones</w:t>
+            </w:r>
+            <w:r>
+              <w:rPr>
+                <w:noProof/>
+                <w:webHidden/>
+              </w:rPr>
+              <w:tab/>
+            </w:r>
+            <w:r>
+              <w:rPr>
+                <w:noProof/>
+                <w:webHidden/>
+              </w:rPr>
+              <w:fldChar w:fldCharType="begin"/>
+            </w:r>
+            <w:r>
+              <w:rPr>
+                <w:noProof/>
+                <w:webHidden/>
+              </w:rPr>
+              <w:instrText xml:space="preserve"> PAGEREF _Toc244063283 \h </w:instrText>
+            </w:r>
+            <w:r>
+              <w:rPr>
+                <w:noProof/>
+                <w:webHidden/>
+              </w:rPr>
+            </w:r>
+            <w:r>
+              <w:rPr>
+                <w:noProof/>
+                <w:webHidden/>
+              </w:rPr>
+              <w:fldChar w:fldCharType="separate"/>
+            </w:r>
+            <w:r>
+              <w:rPr>
+                <w:noProof/>
+                <w:webHidden/>
+              </w:rPr>
+              <w:t>8</w:t>
             </w:r>
             <w:r>
               <w:rPr>
@@ -1797,14 +2341,14 @@
               <w:lang w:val="en-US"/>
             </w:rPr>
           </w:pPr>
-          <w:hyperlink w:anchor="_Toc243510806" w:history="1">
+          <w:hyperlink w:anchor="_Toc244063284" w:history="1">
             <w:r>
               <w:rPr>
                 <w:rStyle w:val="Hipervnculo"/>
                 <w:noProof/>
                 <w:lang w:val="es"/>
               </w:rPr>
-              <w:t>5.4</w:t>
+              <w:t>5.7</w:t>
             </w:r>
             <w:r>
               <w:rPr>
@@ -1821,7 +2365,7 @@
                 <w:noProof/>
                 <w:lang w:val="es"/>
               </w:rPr>
-              <w:t>CU-04 — Cerrar sesión local</w:t>
+              <w:t>Casos incluidos</w:t>
             </w:r>
             <w:r>
               <w:rPr>
@@ -1842,7 +2386,7 @@
                 <w:noProof/>
                 <w:webHidden/>
               </w:rPr>
-              <w:instrText xml:space="preserve"> PAGEREF _Toc243510806 \h </w:instrText>
+              <w:instrText xml:space="preserve"> PAGEREF _Toc244063284 \h </w:instrText>
             </w:r>
             <w:r>
               <w:rPr>
@@ -1862,187 +2406,7 @@
                 <w:noProof/>
                 <w:webHidden/>
               </w:rPr>
-              <w:t>6</w:t>
-            </w:r>
-            <w:r>
-              <w:rPr>
-                <w:noProof/>
-                <w:webHidden/>
-              </w:rPr>
-              <w:fldChar w:fldCharType="end"/>
-            </w:r>
-          </w:hyperlink>
-        </w:p>
-        <w:p>
-          <w:pPr>
-            <w:pStyle w:val="TDC3"/>
-            <w:tabs>
-              <w:tab w:val="left" w:pos="1861"/>
-              <w:tab w:val="right" w:leader="dot" w:pos="8494"/>
-            </w:tabs>
-            <w:rPr>
-              <w:rFonts w:asciiTheme="minorHAnsi" w:eastAsiaTheme="minorEastAsia" w:hAnsiTheme="minorHAnsi" w:cstheme="minorBidi"/>
-              <w:noProof/>
-              <w:color w:val="auto"/>
-              <w:lang w:val="en-US"/>
-            </w:rPr>
-          </w:pPr>
-          <w:hyperlink w:anchor="_Toc243510807" w:history="1">
-            <w:r>
-              <w:rPr>
-                <w:rStyle w:val="Hipervnculo"/>
-                <w:noProof/>
-                <w:lang w:val="es"/>
-              </w:rPr>
-              <w:t>5.4.1</w:t>
-            </w:r>
-            <w:r>
-              <w:rPr>
-                <w:rFonts w:asciiTheme="minorHAnsi" w:eastAsiaTheme="minorEastAsia" w:hAnsiTheme="minorHAnsi" w:cstheme="minorBidi"/>
-                <w:noProof/>
-                <w:color w:val="auto"/>
-                <w:lang w:val="en-US"/>
-              </w:rPr>
-              <w:tab/>
-            </w:r>
-            <w:r>
-              <w:rPr>
-                <w:rStyle w:val="Hipervnculo"/>
-                <w:noProof/>
-                <w:lang w:val="es"/>
-              </w:rPr>
-              <w:t>Flujo principal</w:t>
-            </w:r>
-            <w:r>
-              <w:rPr>
-                <w:noProof/>
-                <w:webHidden/>
-              </w:rPr>
-              <w:tab/>
-            </w:r>
-            <w:r>
-              <w:rPr>
-                <w:noProof/>
-                <w:webHidden/>
-              </w:rPr>
-              <w:fldChar w:fldCharType="begin"/>
-            </w:r>
-            <w:r>
-              <w:rPr>
-                <w:noProof/>
-                <w:webHidden/>
-              </w:rPr>
-              <w:instrText xml:space="preserve"> PAGEREF _Toc243510807 \h </w:instrText>
-            </w:r>
-            <w:r>
-              <w:rPr>
-                <w:noProof/>
-                <w:webHidden/>
-              </w:rPr>
-            </w:r>
-            <w:r>
-              <w:rPr>
-                <w:noProof/>
-                <w:webHidden/>
-              </w:rPr>
-              <w:fldChar w:fldCharType="separate"/>
-            </w:r>
-            <w:r>
-              <w:rPr>
-                <w:noProof/>
-                <w:webHidden/>
-              </w:rPr>
-              <w:t>6</w:t>
-            </w:r>
-            <w:r>
-              <w:rPr>
-                <w:noProof/>
-                <w:webHidden/>
-              </w:rPr>
-              <w:fldChar w:fldCharType="end"/>
-            </w:r>
-          </w:hyperlink>
-        </w:p>
-        <w:p>
-          <w:pPr>
-            <w:pStyle w:val="TDC2"/>
-            <w:tabs>
-              <w:tab w:val="left" w:pos="1421"/>
-              <w:tab w:val="right" w:leader="dot" w:pos="8494"/>
-            </w:tabs>
-            <w:rPr>
-              <w:rFonts w:asciiTheme="minorHAnsi" w:eastAsiaTheme="minorEastAsia" w:hAnsiTheme="minorHAnsi" w:cstheme="minorBidi"/>
-              <w:noProof/>
-              <w:color w:val="auto"/>
-              <w:lang w:val="en-US"/>
-            </w:rPr>
-          </w:pPr>
-          <w:hyperlink w:anchor="_Toc243510808" w:history="1">
-            <w:r>
-              <w:rPr>
-                <w:rStyle w:val="Hipervnculo"/>
-                <w:noProof/>
-                <w:lang w:val="es"/>
-              </w:rPr>
-              <w:t>5.5</w:t>
-            </w:r>
-            <w:r>
-              <w:rPr>
-                <w:rFonts w:asciiTheme="minorHAnsi" w:eastAsiaTheme="minorEastAsia" w:hAnsiTheme="minorHAnsi" w:cstheme="minorBidi"/>
-                <w:noProof/>
-                <w:color w:val="auto"/>
-                <w:lang w:val="en-US"/>
-              </w:rPr>
-              <w:tab/>
-            </w:r>
-            <w:r>
-              <w:rPr>
-                <w:rStyle w:val="Hipervnculo"/>
-                <w:noProof/>
-                <w:lang w:val="es"/>
-              </w:rPr>
-              <w:t>Casos incluidos</w:t>
-            </w:r>
-            <w:r>
-              <w:rPr>
-                <w:noProof/>
-                <w:webHidden/>
-              </w:rPr>
-              <w:tab/>
-            </w:r>
-            <w:r>
-              <w:rPr>
-                <w:noProof/>
-                <w:webHidden/>
-              </w:rPr>
-              <w:fldChar w:fldCharType="begin"/>
-            </w:r>
-            <w:r>
-              <w:rPr>
-                <w:noProof/>
-                <w:webHidden/>
-              </w:rPr>
-              <w:instrText xml:space="preserve"> PAGEREF _Toc243510808 \h </w:instrText>
-            </w:r>
-            <w:r>
-              <w:rPr>
-                <w:noProof/>
-                <w:webHidden/>
-              </w:rPr>
-            </w:r>
-            <w:r>
-              <w:rPr>
-                <w:noProof/>
-                <w:webHidden/>
-              </w:rPr>
-              <w:fldChar w:fldCharType="separate"/>
-            </w:r>
-            <w:r>
-              <w:rPr>
-                <w:noProof/>
-                <w:webHidden/>
-              </w:rPr>
-              <w:t>6</w:t>
+              <w:t>8</w:t>
             </w:r>
             <w:r>
               <w:rPr>
@@ -2067,7 +2431,7 @@
               <w:lang w:val="en-US"/>
             </w:rPr>
           </w:pPr>
-          <w:hyperlink w:anchor="_Toc243510809" w:history="1">
+          <w:hyperlink w:anchor="_Toc244063285" w:history="1">
             <w:r>
               <w:rPr>
                 <w:rStyle w:val="Hipervnculo"/>
@@ -2112,7 +2476,7 @@
                 <w:noProof/>
                 <w:webHidden/>
               </w:rPr>
-              <w:instrText xml:space="preserve"> PAGEREF _Toc243510809 \h </w:instrText>
+              <w:instrText xml:space="preserve"> PAGEREF _Toc244063285 \h </w:instrText>
             </w:r>
             <w:r>
               <w:rPr>
@@ -2132,7 +2496,7 @@
                 <w:noProof/>
                 <w:webHidden/>
               </w:rPr>
-              <w:t>7</w:t>
+              <w:t>8</w:t>
             </w:r>
             <w:r>
               <w:rPr>
@@ -2157,7 +2521,7 @@
               <w:lang w:val="en-US"/>
             </w:rPr>
           </w:pPr>
-          <w:hyperlink w:anchor="_Toc243510810" w:history="1">
+          <w:hyperlink w:anchor="_Toc244063286" w:history="1">
             <w:r>
               <w:rPr>
                 <w:rStyle w:val="Hipervnculo"/>
@@ -2202,7 +2566,7 @@
                 <w:noProof/>
                 <w:webHidden/>
               </w:rPr>
-              <w:instrText xml:space="preserve"> PAGEREF _Toc243510810 \h </w:instrText>
+              <w:instrText xml:space="preserve"> PAGEREF _Toc244063286 \h </w:instrText>
             </w:r>
             <w:r>
               <w:rPr>
@@ -2222,7 +2586,7 @@
                 <w:noProof/>
                 <w:webHidden/>
               </w:rPr>
-              <w:t>7</w:t>
+              <w:t>9</w:t>
             </w:r>
             <w:r>
               <w:rPr>
@@ -2235,27 +2599,22 @@
         </w:p>
         <w:p>
           <w:r>
+            <w:lastRenderedPageBreak/>
             <w:fldChar w:fldCharType="end"/>
           </w:r>
         </w:p>
       </w:sdtContent>
     </w:sdt>
     <w:p>
-      <w:r>
-        <w:br w:type="page"/>
-      </w:r>
-    </w:p>
-    <w:p>
       <w:pPr>
         <w:pStyle w:val="Ttulo1"/>
       </w:pPr>
       <w:bookmarkStart w:id="0" w:name="_24d6119fbff099055344c646b763122868d5e2d"/>
-      <w:bookmarkStart w:id="1" w:name="_Toc243510787"/>
-      <w:r>
-        <w:rPr>
-          <w:lang w:val="es"/>
-        </w:rPr>
-        <w:lastRenderedPageBreak/>
+      <w:bookmarkStart w:id="1" w:name="_Toc244063259"/>
+      <w:r>
+        <w:rPr>
+          <w:lang w:val="es"/>
+        </w:rPr>
         <w:t>1</w:t>
       </w:r>
       <w:r>
@@ -2272,12 +2631,13 @@
     </w:p>
     <w:tbl>
       <w:tblPr>
-        <w:tblW w:w="0" w:type="auto"/>
+        <w:tblW w:w="5000" w:type="pct"/>
+        <w:tblLayout w:type="fixed"/>
         <w:tblLook w:val="0020" w:firstRow="1" w:lastRow="0" w:firstColumn="0" w:lastColumn="0" w:noHBand="0" w:noVBand="0"/>
       </w:tblPr>
       <w:tblGrid>
-        <w:gridCol w:w="2371"/>
-        <w:gridCol w:w="4421"/>
+        <w:gridCol w:w="4252"/>
+        <w:gridCol w:w="4252"/>
       </w:tblGrid>
       <w:tr>
         <w:trPr>
@@ -2285,7 +2645,7 @@
         </w:trPr>
         <w:tc>
           <w:tcPr>
-            <w:tcW w:w="0" w:type="auto"/>
+            <w:tcW w:w="3960" w:type="dxa"/>
           </w:tcPr>
           <w:p>
             <w:r>
@@ -2298,7 +2658,7 @@
         </w:tc>
         <w:tc>
           <w:tcPr>
-            <w:tcW w:w="0" w:type="auto"/>
+            <w:tcW w:w="3960" w:type="dxa"/>
           </w:tcPr>
           <w:p>
             <w:r>
@@ -2313,7 +2673,7 @@
       <w:tr>
         <w:tc>
           <w:tcPr>
-            <w:tcW w:w="0" w:type="auto"/>
+            <w:tcW w:w="3960" w:type="dxa"/>
           </w:tcPr>
           <w:p>
             <w:r>
@@ -2326,7 +2686,7 @@
         </w:tc>
         <w:tc>
           <w:tcPr>
-            <w:tcW w:w="0" w:type="auto"/>
+            <w:tcW w:w="3960" w:type="dxa"/>
           </w:tcPr>
           <w:p>
             <w:r>
@@ -2341,7 +2701,7 @@
       <w:tr>
         <w:tc>
           <w:tcPr>
-            <w:tcW w:w="0" w:type="auto"/>
+            <w:tcW w:w="3960" w:type="dxa"/>
           </w:tcPr>
           <w:p>
             <w:r>
@@ -2354,7 +2714,7 @@
         </w:tc>
         <w:tc>
           <w:tcPr>
-            <w:tcW w:w="0" w:type="auto"/>
+            <w:tcW w:w="3960" w:type="dxa"/>
           </w:tcPr>
           <w:p>
             <w:r>
@@ -2369,7 +2729,7 @@
       <w:tr>
         <w:tc>
           <w:tcPr>
-            <w:tcW w:w="0" w:type="auto"/>
+            <w:tcW w:w="3960" w:type="dxa"/>
           </w:tcPr>
           <w:p>
             <w:r>
@@ -2382,14 +2742,14 @@
         </w:tc>
         <w:tc>
           <w:tcPr>
-            <w:tcW w:w="0" w:type="auto"/>
-          </w:tcPr>
-          <w:p>
-            <w:r>
-              <w:rPr>
-                <w:lang w:val="es"/>
-              </w:rPr>
-              <w:t>1.0</w:t>
+            <w:tcW w:w="3960" w:type="dxa"/>
+          </w:tcPr>
+          <w:p>
+            <w:r>
+              <w:rPr>
+                <w:lang w:val="es"/>
+              </w:rPr>
+              <w:t>2.1</w:t>
             </w:r>
           </w:p>
         </w:tc>
@@ -2397,7 +2757,7 @@
       <w:tr>
         <w:tc>
           <w:tcPr>
-            <w:tcW w:w="0" w:type="auto"/>
+            <w:tcW w:w="3960" w:type="dxa"/>
           </w:tcPr>
           <w:p>
             <w:r>
@@ -2410,14 +2770,14 @@
         </w:tc>
         <w:tc>
           <w:tcPr>
-            <w:tcW w:w="0" w:type="auto"/>
-          </w:tcPr>
-          <w:p>
-            <w:r>
-              <w:rPr>
-                <w:lang w:val="es"/>
-              </w:rPr>
-              <w:t>Línea base documental del código del proyecto</w:t>
+            <w:tcW w:w="3960" w:type="dxa"/>
+          </w:tcPr>
+          <w:p>
+            <w:r>
+              <w:rPr>
+                <w:lang w:val="es"/>
+              </w:rPr>
+              <w:t>Especificación alineada al código; aceptación formal por verificar</w:t>
             </w:r>
           </w:p>
         </w:tc>
@@ -2425,7 +2785,7 @@
       <w:tr>
         <w:tc>
           <w:tcPr>
-            <w:tcW w:w="0" w:type="auto"/>
+            <w:tcW w:w="3960" w:type="dxa"/>
           </w:tcPr>
           <w:p>
             <w:r>
@@ -2438,14 +2798,14 @@
         </w:tc>
         <w:tc>
           <w:tcPr>
-            <w:tcW w:w="0" w:type="auto"/>
-          </w:tcPr>
-          <w:p>
-            <w:r>
-              <w:rPr>
-                <w:lang w:val="es"/>
-              </w:rPr>
-              <w:t>ERS_EUREKABANK_SOAP_JAVA_GR09.docx</w:t>
+            <w:tcW w:w="3960" w:type="dxa"/>
+          </w:tcPr>
+          <w:p>
+            <w:r>
+              <w:rPr>
+                <w:lang w:val="es"/>
+              </w:rPr>
+              <w:t>ERS_EUREKABANK_SOAP_JAVA_GR09</w:t>
             </w:r>
           </w:p>
         </w:tc>
@@ -2456,7 +2816,7 @@
         <w:pStyle w:val="Ttulo1"/>
       </w:pPr>
       <w:bookmarkStart w:id="2" w:name="_introducción"/>
-      <w:bookmarkStart w:id="3" w:name="_Toc243510788"/>
+      <w:bookmarkStart w:id="3" w:name="_Toc244063260"/>
       <w:r>
         <w:rPr>
           <w:lang w:val="es"/>
@@ -2480,7 +2840,19 @@
         <w:rPr>
           <w:lang w:val="es"/>
         </w:rPr>
-        <w:t>Este documento describe los objetivos del usuario y los flujos funcionales de EurekaBank. El modelo se limita a las operaciones existentes en el servidor SOAP y a los flujos de consola y escritorio observados en el repositorio. Se conserva la organización visual de la documentación de referencia, adaptando actores, operaciones y restricciones al sistema bancario.</w:t>
+        <w:t>Este documento describe los objetivos de los usuar</w:t>
+      </w:r>
+      <w:r>
+        <w:rPr>
+          <w:lang w:val="es"/>
+        </w:rPr>
+        <w:t>ios y sus flujos en EurekaBank. El sistema cuenta con un servidor Java SOAP, persistencia MySQL y cuatro clientes: consola, escritorio, Android y web. Los clientes consumen las mismas operaciones; el servidor valida la sesión y concentra las reglas de nego</w:t>
+      </w:r>
+      <w:r>
+        <w:rPr>
+          <w:lang w:val="es"/>
+        </w:rPr>
+        <w:t>cio y las transacciones bancarias.</w:t>
       </w:r>
     </w:p>
     <w:p>
@@ -2488,7 +2860,7 @@
         <w:pStyle w:val="Ttulo1"/>
       </w:pPr>
       <w:bookmarkStart w:id="4" w:name="_892cc506dd963316632235ac0aa8573ce139490"/>
-      <w:bookmarkStart w:id="5" w:name="_Toc243510789"/>
+      <w:bookmarkStart w:id="5" w:name="_Toc244063261"/>
       <w:r>
         <w:rPr>
           <w:lang w:val="es"/>
@@ -2512,21 +2884,13 @@
         <w:rPr>
           <w:lang w:val="es"/>
         </w:rPr>
-        <w:t xml:space="preserve">El sistema de casos de uso incluye autenticación, consulta de movimientos, registro de depósitos y cierre de la sesión local del cliente. El actor principal es el </w:t>
-      </w:r>
-      <w:r>
-        <w:rPr>
-          <w:b/>
-          <w:bCs/>
-          <w:lang w:val="es"/>
-        </w:rPr>
-        <w:t>Usuario autorizado</w:t>
-      </w:r>
-      <w:r>
-        <w:rPr>
-          <w:lang w:val="es"/>
-        </w:rPr>
-        <w:t>, quien opera la solución desde el cliente de consola o el cliente de escritorio.</w:t>
+        <w:t>El modelo contempla iniciar sesión, consultar cuentas, consultar movimientos, registrar depósitos, transferir fondos y cerrar la sesión remota. El actor principal es Usuario, quien opera cualquiera de lo</w:t>
+      </w:r>
+      <w:r>
+        <w:rPr>
+          <w:lang w:val="es"/>
+        </w:rPr>
+        <w:t>s cuatro clientes.</w:t>
       </w:r>
     </w:p>
     <w:p>
@@ -2537,7 +2901,13 @@
         <w:rPr>
           <w:lang w:val="es"/>
         </w:rPr>
-        <w:t>La base de datos, el servidor Payara y SOAP son componentes de la solución y no actores humanos. La figura representa objetivos funcionales; no afirma que cada operación de consulta o depósito tenga autorización de sesión aplicada por el servidor.</w:t>
+        <w:t>Payara, SOAP y MySQL son componentes técnicos, no actores humanos. Los casos protegidos requieren un token vigente. La operación login, publicada por compatibilidad, valida credenciales sin crear token y no habilita operaciones bancarias</w:t>
+      </w:r>
+      <w:r>
+        <w:rPr>
+          <w:lang w:val="es"/>
+        </w:rPr>
+        <w:t>.</w:t>
       </w:r>
     </w:p>
     <w:p>
@@ -2545,7 +2915,7 @@
         <w:pStyle w:val="Ttulo1"/>
       </w:pPr>
       <w:bookmarkStart w:id="6" w:name="_5ff6c48814c1715608a70e9d7f5abffb511c202"/>
-      <w:bookmarkStart w:id="7" w:name="_Toc243510790"/>
+      <w:bookmarkStart w:id="7" w:name="_Toc244063262"/>
       <w:r>
         <w:rPr>
           <w:lang w:val="es"/>
@@ -2569,11 +2939,12 @@
         <w:rPr>
           <w:noProof/>
         </w:rPr>
+        <w:lastRenderedPageBreak/>
         <w:drawing>
-          <wp:inline distT="0" distB="0" distL="0" distR="0" wp14:anchorId="2B0F9607" wp14:editId="0FFB503B">
-            <wp:extent cx="5397500" cy="3023730"/>
+          <wp:inline distT="0" distB="0" distL="0" distR="0" wp14:anchorId="4C91E43D" wp14:editId="13EDCC15">
+            <wp:extent cx="5397500" cy="5751849"/>
             <wp:effectExtent l="0" t="0" r="0" b="0"/>
-            <wp:docPr id="27" name="Picture" descr="Diagrama de casos de uso EurekaBank, grupo 09"/>
+            <wp:docPr id="27" name="Picture" descr="Ilustración 1. Diagrama de casos de uso EurekaBank, grupo 09"/>
             <wp:cNvGraphicFramePr/>
             <a:graphic xmlns:a="http://schemas.openxmlformats.org/drawingml/2006/main">
               <a:graphicData uri="http://schemas.openxmlformats.org/drawingml/2006/picture">
@@ -2593,7 +2964,7 @@
                   <pic:spPr bwMode="auto">
                     <a:xfrm>
                       <a:off x="0" y="0"/>
-                      <a:ext cx="5397500" cy="3023730"/>
+                      <a:ext cx="5397500" cy="5751849"/>
                     </a:xfrm>
                     <a:prstGeom prst="rect">
                       <a:avLst/>
@@ -2617,7 +2988,7 @@
         <w:rPr>
           <w:lang w:val="es"/>
         </w:rPr>
-        <w:t>Diagrama de casos de uso EurekaBank, grupo 09</w:t>
+        <w:t>Ilustración 1. Diagrama de casos de uso EurekaBank, grupo 09</w:t>
       </w:r>
     </w:p>
     <w:p>
@@ -2625,7 +2996,7 @@
         <w:pStyle w:val="Ttulo2"/>
       </w:pPr>
       <w:bookmarkStart w:id="8" w:name="_d8e4ee5e41695f5fe4ac5d8cdfeca7c96f3e079"/>
-      <w:bookmarkStart w:id="9" w:name="_Toc243510791"/>
+      <w:bookmarkStart w:id="9" w:name="_Toc244063263"/>
       <w:r>
         <w:rPr>
           <w:lang w:val="es"/>
@@ -2655,8 +3026,7 @@
         <w:rPr>
           <w:lang w:val="es"/>
         </w:rPr>
-        <w:lastRenderedPageBreak/>
-        <w:t>El actor Usuario autorizado participa en los cuatro objetivos principales.</w:t>
+        <w:t>El actor Usuario participa en los seis objetivos principales.</w:t>
       </w:r>
     </w:p>
     <w:p>
@@ -2670,7 +3040,13 @@
         <w:rPr>
           <w:lang w:val="es"/>
         </w:rPr>
-        <w:t>&lt;&lt;include&gt;&gt; apunta desde el caso principal hacia el comportamiento incluido, obligatorio en ese flujo.</w:t>
+        <w:t>&lt;</w:t>
+      </w:r>
+      <w:r>
+        <w:rPr>
+          <w:lang w:val="es"/>
+        </w:rPr>
+        <w:t>&gt; apunta desde el caso que requiere el comportamiento hacia el caso incluido.</w:t>
       </w:r>
     </w:p>
     <w:p>
@@ -2684,7 +3060,7 @@
         <w:rPr>
           <w:lang w:val="es"/>
         </w:rPr>
-        <w:t>CU-01 incluye CU-05 Validar credenciales.</w:t>
+        <w:t>CU-01 incluye CU-07 Validar credenciales.</w:t>
       </w:r>
     </w:p>
     <w:p>
@@ -2698,7 +3074,7 @@
         <w:rPr>
           <w:lang w:val="es"/>
         </w:rPr>
-        <w:t>CU-02 y CU-03 incluyen CU-06 Validar cuenta.</w:t>
+        <w:t>CU-02 a CU-06 exigen un token vigente como precondición; el servidor verifica ese token en cada operación protegida.</w:t>
       </w:r>
     </w:p>
     <w:p>
@@ -2712,7 +3088,13 @@
         <w:rPr>
           <w:lang w:val="es"/>
         </w:rPr>
-        <w:t>CU-03 incluye CU-07 Validar datos del depósito y CU-08 Aplicar depósito.</w:t>
+        <w:t>CU-03 incluye CU-08</w:t>
+      </w:r>
+      <w:r>
+        <w:rPr>
+          <w:lang w:val="es"/>
+        </w:rPr>
+        <w:t xml:space="preserve"> Validar cuenta.</w:t>
       </w:r>
     </w:p>
     <w:p>
@@ -2726,7 +3108,7 @@
         <w:rPr>
           <w:lang w:val="es"/>
         </w:rPr>
-        <w:t>No se modelan relaciones &lt;&lt;extend&gt;&gt;: los rechazos, errores de conexión y resultados vacíos son flujos alternativos de los casos principales, no objetivos opcionales independientes.</w:t>
+        <w:t>CU-04 incluye CU-08 Validar cuenta, CU-09 Validar datos del depósito y CU-10 Aplicar depósito.</w:t>
       </w:r>
     </w:p>
     <w:p>
@@ -2740,7 +3122,21 @@
         <w:rPr>
           <w:lang w:val="es"/>
         </w:rPr>
-        <w:t>El cierre de sesión es local al cliente y no genera una operación SOAP.</w:t>
+        <w:t>CU-05 incluye CU-08 Validar cuenta. La validación de solicitud, idempotencia y transacción también se especifican en el flujo de transferencia.</w:t>
+      </w:r>
+    </w:p>
+    <w:p>
+      <w:pPr>
+        <w:numPr>
+          <w:ilvl w:val="0"/>
+          <w:numId w:val="1"/>
+        </w:numPr>
+      </w:pPr>
+      <w:r>
+        <w:rPr>
+          <w:lang w:val="es"/>
+        </w:rPr>
+        <w:t>CU-06 exige token vigente, lo revoca en el servidor y elimina la copia local del cliente.</w:t>
       </w:r>
     </w:p>
     <w:p>
@@ -2748,11 +3144,12 @@
         <w:pStyle w:val="Ttulo2"/>
       </w:pPr>
       <w:bookmarkStart w:id="10" w:name="_31ab9b375167e9c607e0b9e625f3be844427b8f"/>
-      <w:bookmarkStart w:id="11" w:name="_Toc243510792"/>
-      <w:r>
-        <w:rPr>
-          <w:lang w:val="es"/>
-        </w:rPr>
+      <w:bookmarkStart w:id="11" w:name="_Toc244063264"/>
+      <w:r>
+        <w:rPr>
+          <w:lang w:val="es"/>
+        </w:rPr>
+        <w:lastRenderedPageBreak/>
         <w:t>4.2</w:t>
       </w:r>
       <w:r>
@@ -2858,7 +3255,7 @@
               <w:rPr>
                 <w:lang w:val="es"/>
               </w:rPr>
-              <w:t>Validar las credenciales del usuario y permitir que el flujo del cliente continúe.</w:t>
+              <w:t>Validar credenciales y obtener un token temporal.</w:t>
             </w:r>
           </w:p>
         </w:tc>
@@ -2886,7 +3283,7 @@
               <w:rPr>
                 <w:lang w:val="es"/>
               </w:rPr>
-              <w:t>Consultar movimientos</w:t>
+              <w:t>Consultar cuentas</w:t>
             </w:r>
           </w:p>
         </w:tc>
@@ -2899,7 +3296,13 @@
               <w:rPr>
                 <w:lang w:val="es"/>
               </w:rPr>
-              <w:t>Presentar los movimientos de una cuenta consultada.</w:t>
+              <w:t>Presentar las cuentas ac</w:t>
+            </w:r>
+            <w:r>
+              <w:rPr>
+                <w:lang w:val="es"/>
+              </w:rPr>
+              <w:t>tivas asociadas al cliente autenticado.</w:t>
             </w:r>
           </w:p>
         </w:tc>
@@ -2927,7 +3330,7 @@
               <w:rPr>
                 <w:lang w:val="es"/>
               </w:rPr>
-              <w:t>Registrar depósito</w:t>
+              <w:t>Consultar movimientos</w:t>
             </w:r>
           </w:p>
         </w:tc>
@@ -2940,7 +3343,7 @@
               <w:rPr>
                 <w:lang w:val="es"/>
               </w:rPr>
-              <w:t>Acreditar un importe en una cuenta activa y registrar el movimiento.</w:t>
+              <w:t>Consultar y mostrar el historial de una cuenta propia activa.</w:t>
             </w:r>
           </w:p>
         </w:tc>
@@ -2968,7 +3371,7 @@
               <w:rPr>
                 <w:lang w:val="es"/>
               </w:rPr>
-              <w:t>Cerrar sesión local</w:t>
+              <w:t>Registrar depósito</w:t>
             </w:r>
           </w:p>
         </w:tc>
@@ -2981,7 +3384,7 @@
               <w:rPr>
                 <w:lang w:val="es"/>
               </w:rPr>
-              <w:t>Salir del menú y retornar al formulario de ingreso o finalizar el cliente.</w:t>
+              <w:t>Acreditar un importe válido y registrar el movimiento en una transacción.</w:t>
             </w:r>
           </w:p>
         </w:tc>
@@ -3009,7 +3412,7 @@
               <w:rPr>
                 <w:lang w:val="es"/>
               </w:rPr>
-              <w:t>Validar credenciales</w:t>
+              <w:t>Transferir fondos</w:t>
             </w:r>
           </w:p>
         </w:tc>
@@ -3022,7 +3425,7 @@
               <w:rPr>
                 <w:lang w:val="es"/>
               </w:rPr>
-              <w:t>Comprobar las credenciales almacenadas para el usuario ingresado.</w:t>
+              <w:t>Debitar origen y acreditar destino de forma atómica e idempotente.</w:t>
             </w:r>
           </w:p>
         </w:tc>
@@ -3050,7 +3453,7 @@
               <w:rPr>
                 <w:lang w:val="es"/>
               </w:rPr>
-              <w:t>Validar cuenta</w:t>
+              <w:t>Cerrar sesión</w:t>
             </w:r>
           </w:p>
         </w:tc>
@@ -3063,7 +3466,7 @@
               <w:rPr>
                 <w:lang w:val="es"/>
               </w:rPr>
-              <w:t>Comprobar que el identificador recibido no esté vacío y no exceda ocho caracteres.</w:t>
+              <w:t>Revocar el token y finalizar el acceso del cliente.</w:t>
             </w:r>
           </w:p>
         </w:tc>
@@ -3091,7 +3494,13 @@
               <w:rPr>
                 <w:lang w:val="es"/>
               </w:rPr>
-              <w:t>Validar datos del depósito</w:t>
+              <w:t>Validar cr</w:t>
+            </w:r>
+            <w:r>
+              <w:rPr>
+                <w:lang w:val="es"/>
+              </w:rPr>
+              <w:t>edenciales</w:t>
             </w:r>
           </w:p>
         </w:tc>
@@ -3104,7 +3513,7 @@
               <w:rPr>
                 <w:lang w:val="es"/>
               </w:rPr>
-              <w:t>Comprobar que el importe sea positivo, exacto a centavos y de precisión admitida.</w:t>
+              <w:t>Verificar contraseña y asociación del usuario con un cliente.</w:t>
             </w:r>
           </w:p>
         </w:tc>
@@ -3132,6 +3541,88 @@
               <w:rPr>
                 <w:lang w:val="es"/>
               </w:rPr>
+              <w:t>Validar cuenta</w:t>
+            </w:r>
+          </w:p>
+        </w:tc>
+        <w:tc>
+          <w:tcPr>
+            <w:tcW w:w="2640" w:type="dxa"/>
+          </w:tcPr>
+          <w:p>
+            <w:r>
+              <w:rPr>
+                <w:lang w:val="es"/>
+              </w:rPr>
+              <w:t>Comprobar formato, estado activo y restricciones de titularidad.</w:t>
+            </w:r>
+          </w:p>
+        </w:tc>
+      </w:tr>
+      <w:tr>
+        <w:tc>
+          <w:tcPr>
+            <w:tcW w:w="2640" w:type="dxa"/>
+          </w:tcPr>
+          <w:p>
+            <w:r>
+              <w:rPr>
+                <w:lang w:val="es"/>
+              </w:rPr>
+              <w:t>CU-09</w:t>
+            </w:r>
+          </w:p>
+        </w:tc>
+        <w:tc>
+          <w:tcPr>
+            <w:tcW w:w="2640" w:type="dxa"/>
+          </w:tcPr>
+          <w:p>
+            <w:r>
+              <w:rPr>
+                <w:lang w:val="es"/>
+              </w:rPr>
+              <w:t>Validar datos del depósito</w:t>
+            </w:r>
+          </w:p>
+        </w:tc>
+        <w:tc>
+          <w:tcPr>
+            <w:tcW w:w="2640" w:type="dxa"/>
+          </w:tcPr>
+          <w:p>
+            <w:r>
+              <w:rPr>
+                <w:lang w:val="es"/>
+              </w:rPr>
+              <w:t>Exigir importe positivo, exacto a centavos y dentro de precisión.</w:t>
+            </w:r>
+          </w:p>
+        </w:tc>
+      </w:tr>
+      <w:tr>
+        <w:tc>
+          <w:tcPr>
+            <w:tcW w:w="2640" w:type="dxa"/>
+          </w:tcPr>
+          <w:p>
+            <w:r>
+              <w:rPr>
+                <w:lang w:val="es"/>
+              </w:rPr>
+              <w:t>CU-10</w:t>
+            </w:r>
+          </w:p>
+        </w:tc>
+        <w:tc>
+          <w:tcPr>
+            <w:tcW w:w="2640" w:type="dxa"/>
+          </w:tcPr>
+          <w:p>
+            <w:r>
+              <w:rPr>
+                <w:lang w:val="es"/>
+              </w:rPr>
               <w:t>Aplicar depósito</w:t>
             </w:r>
           </w:p>
@@ -3145,28 +3636,22 @@
               <w:rPr>
                 <w:lang w:val="es"/>
               </w:rPr>
-              <w:t>Actualizar saldo y contador, insertar movimiento y confirmar de forma atómica.</w:t>
+              <w:t>Actualizar saldo y registrar movimiento en una sola transacción.</w:t>
             </w:r>
           </w:p>
         </w:tc>
       </w:tr>
     </w:tbl>
     <w:p>
-      <w:r>
-        <w:br w:type="page"/>
-      </w:r>
-    </w:p>
-    <w:p>
       <w:pPr>
         <w:pStyle w:val="Ttulo1"/>
       </w:pPr>
       <w:bookmarkStart w:id="12" w:name="_7346fa8db0e0d4f504f9a3369e421c39239ba02"/>
-      <w:bookmarkStart w:id="13" w:name="_Toc243510793"/>
-      <w:r>
-        <w:rPr>
-          <w:lang w:val="es"/>
-        </w:rPr>
-        <w:lastRenderedPageBreak/>
+      <w:bookmarkStart w:id="13" w:name="_Toc244063265"/>
+      <w:r>
+        <w:rPr>
+          <w:lang w:val="es"/>
+        </w:rPr>
         <w:t>5</w:t>
       </w:r>
       <w:r>
@@ -3186,7 +3671,7 @@
         <w:pStyle w:val="Ttulo2"/>
       </w:pPr>
       <w:bookmarkStart w:id="14" w:name="_82e902ca67f177c96076810f98709a1c16c83fa"/>
-      <w:bookmarkStart w:id="15" w:name="_Toc243510794"/>
+      <w:bookmarkStart w:id="15" w:name="_Toc244063266"/>
       <w:r>
         <w:rPr>
           <w:lang w:val="es"/>
@@ -3269,7 +3754,7 @@
               <w:rPr>
                 <w:lang w:val="es"/>
               </w:rPr>
-              <w:t>Usuario autorizado</w:t>
+              <w:t>Usuario</w:t>
             </w:r>
           </w:p>
         </w:tc>
@@ -3297,7 +3782,7 @@
               <w:rPr>
                 <w:lang w:val="es"/>
               </w:rPr>
-              <w:t>Permitir que el usuario inicie el flujo del cliente con sus credenciales.</w:t>
+              <w:t>Obtener una sesión remota asociada a la identidad del usuario.</w:t>
             </w:r>
           </w:p>
         </w:tc>
@@ -3325,7 +3810,14 @@
               <w:rPr>
                 <w:lang w:val="es"/>
               </w:rPr>
-              <w:t>El usuario abre el cliente e indica que desea ingresar.</w:t>
+              <w:t xml:space="preserve">El usuario abre un cliente e ingresa sus </w:t>
+            </w:r>
+            <w:r>
+              <w:rPr>
+                <w:lang w:val="es"/>
+              </w:rPr>
+              <w:lastRenderedPageBreak/>
+              <w:t>credenciales.</w:t>
             </w:r>
           </w:p>
         </w:tc>
@@ -3340,6 +3832,7 @@
               <w:rPr>
                 <w:lang w:val="es"/>
               </w:rPr>
+              <w:lastRenderedPageBreak/>
               <w:t>Precondiciones</w:t>
             </w:r>
           </w:p>
@@ -3353,7 +3846,7 @@
               <w:rPr>
                 <w:lang w:val="es"/>
               </w:rPr>
-              <w:t>El servicio SOAP está publicado y la base de datos de autenticación está disponible. El usuario dispone de credenciales registradas.</w:t>
+              <w:t>El endpoint SOAP y la base de autenticación están disponibles; existe un código de cliente asociado al usuario.</w:t>
             </w:r>
           </w:p>
         </w:tc>
@@ -3381,7 +3874,7 @@
               <w:rPr>
                 <w:lang w:val="es"/>
               </w:rPr>
-              <w:t>El cliente acepta la respuesta 1 y muestra el menú de operaciones. No se crea una sesión remota ni un token.</w:t>
+              <w:t>crearSesion devuelve un token opaco y el cliente muestra el menú.</w:t>
             </w:r>
           </w:p>
         </w:tc>
@@ -3392,7 +3885,7 @@
         <w:pStyle w:val="Ttulo3"/>
       </w:pPr>
       <w:bookmarkStart w:id="16" w:name="_d35ecbd37d8eccdb5261d6292413d76b9120a0a"/>
-      <w:bookmarkStart w:id="17" w:name="_Toc243510795"/>
+      <w:bookmarkStart w:id="17" w:name="_Toc244063267"/>
       <w:r>
         <w:rPr>
           <w:lang w:val="es"/>
@@ -3422,7 +3915,13 @@
         <w:rPr>
           <w:lang w:val="es"/>
         </w:rPr>
-        <w:t>El cliente solicita el nombre de usuario y la contraseña.</w:t>
+        <w:t>El cliente solicita usuario y contra</w:t>
+      </w:r>
+      <w:r>
+        <w:rPr>
+          <w:lang w:val="es"/>
+        </w:rPr>
+        <w:t>seña.</w:t>
       </w:r>
     </w:p>
     <w:p>
@@ -3450,7 +3949,7 @@
         <w:rPr>
           <w:lang w:val="es"/>
         </w:rPr>
-        <w:t>El cliente invoca la operación SOAP login(usuario, contrasena).</w:t>
+        <w:t>El adaptador SOAP invoca crearSesion.</w:t>
       </w:r>
     </w:p>
     <w:p>
@@ -3464,7 +3963,7 @@
         <w:rPr>
           <w:lang w:val="es"/>
         </w:rPr>
-        <w:t>El servicio valida los parámetros y consulta la credencial asociada al usuario.</w:t>
+        <w:t>El servidor valida límites, consulta Credenciales y verifica el hash PBKDF2.</w:t>
       </w:r>
     </w:p>
     <w:p>
@@ -3478,7 +3977,7 @@
         <w:rPr>
           <w:lang w:val="es"/>
         </w:rPr>
-        <w:t>El servidor verifica el hash PBKDF2-HMAC-SHA-256 de la contraseña.</w:t>
+        <w:t>El servidor obtiene el código de cliente y crea una sesión temporal de 20 minutos.</w:t>
       </w:r>
     </w:p>
     <w:p>
@@ -3492,21 +3991,13 @@
         <w:rPr>
           <w:lang w:val="es"/>
         </w:rPr>
-        <w:t>El servicio responde 1 si la validación es correcta.</w:t>
-      </w:r>
-    </w:p>
-    <w:p>
-      <w:pPr>
-        <w:numPr>
-          <w:ilvl w:val="0"/>
-          <w:numId w:val="2"/>
-        </w:numPr>
-      </w:pPr>
-      <w:r>
-        <w:rPr>
-          <w:lang w:val="es"/>
-        </w:rPr>
-        <w:t>El cliente presenta el menú de consulta, depósito y salida.</w:t>
+        <w:t>El cliente cons</w:t>
+      </w:r>
+      <w:r>
+        <w:rPr>
+          <w:lang w:val="es"/>
+        </w:rPr>
+        <w:t>erva el token y muestra el menú de operaciones.</w:t>
       </w:r>
     </w:p>
     <w:p>
@@ -3514,7 +4005,7 @@
         <w:pStyle w:val="Ttulo3"/>
       </w:pPr>
       <w:bookmarkStart w:id="18" w:name="_21ff93db2a4980404ec5e3f919643358ffdd3bc"/>
-      <w:bookmarkStart w:id="19" w:name="_Toc243510796"/>
+      <w:bookmarkStart w:id="19" w:name="_Toc244063268"/>
       <w:r>
         <w:rPr>
           <w:lang w:val="es"/>
@@ -3546,13 +4037,13 @@
           <w:bCs/>
           <w:lang w:val="es"/>
         </w:rPr>
-        <w:t>A1 — Credenciales incorrectas:</w:t>
-      </w:r>
-      <w:r>
-        <w:rPr>
-          <w:lang w:val="es"/>
-        </w:rPr>
-        <w:t xml:space="preserve"> el servicio responde -1; el cliente informa que el usuario o la contraseña son incorrectos y no habilita el menú.</w:t>
+        <w:t>A1 — Credenciales incorrectas o usuario sin cliente asociado:</w:t>
+      </w:r>
+      <w:r>
+        <w:rPr>
+          <w:lang w:val="es"/>
+        </w:rPr>
+        <w:t xml:space="preserve"> crearSesion devuelve null; el cliente muestra el rechazo y no habilita operaciones.</w:t>
       </w:r>
     </w:p>
     <w:p>
@@ -3568,13 +4059,21 @@
           <w:bCs/>
           <w:lang w:val="es"/>
         </w:rPr>
-        <w:t>A2 — Datos faltantes o fuera de límites:</w:t>
-      </w:r>
-      <w:r>
-        <w:rPr>
-          <w:lang w:val="es"/>
-        </w:rPr>
-        <w:t xml:space="preserve"> la validación rechaza el usuario vacío, usuario de más de 30 caracteres, contraseña vacía o contraseña de más de 1024 caracteres.</w:t>
+        <w:t>A2 — Datos fuera de lí</w:t>
+      </w:r>
+      <w:r>
+        <w:rPr>
+          <w:b/>
+          <w:bCs/>
+          <w:lang w:val="es"/>
+        </w:rPr>
+        <w:t>mites:</w:t>
+      </w:r>
+      <w:r>
+        <w:rPr>
+          <w:lang w:val="es"/>
+        </w:rPr>
+        <w:t xml:space="preserve"> el servicio rechaza usuario vacío o de más de 30 caracteres, contraseña vacía o de más de 1024 caracteres.</w:t>
       </w:r>
     </w:p>
     <w:p>
@@ -3596,20 +4095,48 @@
         <w:rPr>
           <w:lang w:val="es"/>
         </w:rPr>
-        <w:t xml:space="preserve"> el servicio no puede completar la operación; el cliente muestra un mensaje de comunicación o autenticación fallida y permanece en el ingreso.</w:t>
-      </w:r>
-    </w:p>
-    <w:p>
-      <w:pPr>
-        <w:pStyle w:val="Ttulo3"/>
-      </w:pPr>
-      <w:bookmarkStart w:id="20" w:name="_10c9f51d4061c7e8aadc4c92c61d398adeb1909"/>
-      <w:bookmarkStart w:id="21" w:name="_Toc243510797"/>
-      <w:r>
-        <w:rPr>
-          <w:lang w:val="es"/>
-        </w:rPr>
-        <w:t>5.1.3</w:t>
+        <w:t xml:space="preserve"> el cliente informa el fallo sin crear una sesión.</w:t>
+      </w:r>
+    </w:p>
+    <w:p>
+      <w:pPr>
+        <w:numPr>
+          <w:ilvl w:val="0"/>
+          <w:numId w:val="3"/>
+        </w:numPr>
+      </w:pPr>
+      <w:r>
+        <w:rPr>
+          <w:b/>
+          <w:bCs/>
+          <w:lang w:val="es"/>
+        </w:rPr>
+        <w:t>A4 — Operación login de compatibilidad:</w:t>
+      </w:r>
+      <w:r>
+        <w:rPr>
+          <w:lang w:val="es"/>
+        </w:rPr>
+        <w:t xml:space="preserve"> devuelve</w:t>
+      </w:r>
+      <w:r>
+        <w:rPr>
+          <w:lang w:val="es"/>
+        </w:rPr>
+        <w:t xml:space="preserve"> 1 o -1, pero no crea token ni autoriza las operaciones protegidas.</w:t>
+      </w:r>
+    </w:p>
+    <w:p>
+      <w:pPr>
+        <w:pStyle w:val="Ttulo2"/>
+      </w:pPr>
+      <w:bookmarkStart w:id="20" w:name="_d531b47468f0ab1ba1e12a00b27e4db546dd932"/>
+      <w:bookmarkStart w:id="21" w:name="_Toc244063269"/>
+      <w:r>
+        <w:rPr>
+          <w:lang w:val="es"/>
+        </w:rPr>
+        <w:t>5.2</w:t>
       </w:r>
       <w:r>
         <w:tab/>
@@ -3618,42 +4145,10 @@
         <w:rPr>
           <w:lang w:val="es"/>
         </w:rPr>
-        <w:t>Variación por cliente</w:t>
+        <w:t>CU-02 — Consultar cuentas</w:t>
       </w:r>
       <w:bookmarkEnd w:id="20"/>
       <w:bookmarkEnd w:id="21"/>
-    </w:p>
-    <w:p>
-      <w:r>
-        <w:rPr>
-          <w:lang w:val="es"/>
-        </w:rPr>
-        <w:t>El cliente de escritorio abre la pantalla principal luego del resultado positivo. El cliente de consola autentica al usuario antes de entrar al ciclo del menú; al salir del menú finaliza su flujo.</w:t>
-      </w:r>
-    </w:p>
-    <w:p>
-      <w:pPr>
-        <w:pStyle w:val="Ttulo2"/>
-      </w:pPr>
-      <w:bookmarkStart w:id="22" w:name="_5b703e955c83e1ee0b75fbb603dab4285a02740"/>
-      <w:bookmarkStart w:id="23" w:name="_Toc243510798"/>
-      <w:r>
-        <w:rPr>
-          <w:lang w:val="es"/>
-        </w:rPr>
-        <w:t>5.2</w:t>
-      </w:r>
-      <w:r>
-        <w:tab/>
-      </w:r>
-      <w:r>
-        <w:rPr>
-          <w:lang w:val="es"/>
-        </w:rPr>
-        <w:t>CU-02 — Consultar movimientos</w:t>
-      </w:r>
-      <w:bookmarkEnd w:id="22"/>
-      <w:bookmarkEnd w:id="23"/>
     </w:p>
     <w:tbl>
       <w:tblPr>
@@ -3719,7 +4214,7 @@
               <w:rPr>
                 <w:lang w:val="es"/>
               </w:rPr>
-              <w:t>Usuario autorizado</w:t>
+              <w:t>Usuario</w:t>
             </w:r>
           </w:p>
         </w:tc>
@@ -3734,7 +4229,6 @@
               <w:rPr>
                 <w:lang w:val="es"/>
               </w:rPr>
-              <w:lastRenderedPageBreak/>
               <w:t>Propósito</w:t>
             </w:r>
           </w:p>
@@ -3748,7 +4242,7 @@
               <w:rPr>
                 <w:lang w:val="es"/>
               </w:rPr>
-              <w:t>Consultar los movimientos registrados para una cuenta.</w:t>
+              <w:t>Mostrar las cuentas activas vinculadas al cliente autenticado.</w:t>
             </w:r>
           </w:p>
         </w:tc>
@@ -3776,7 +4270,7 @@
               <w:rPr>
                 <w:lang w:val="es"/>
               </w:rPr>
-              <w:t>El usuario selecciona “Consultar movimientos”.</w:t>
+              <w:t>El usuario abre la vista de cuentas o el menú inicial carga las cuentas.</w:t>
             </w:r>
           </w:p>
         </w:tc>
@@ -3804,7 +4298,7 @@
               <w:rPr>
                 <w:lang w:val="es"/>
               </w:rPr>
-              <w:t>El usuario llegó al menú del cliente y el servicio SOAP está disponible. El identificador de cuenta no está vacío y no excede ocho caracteres.</w:t>
+              <w:t>Existe un token vigente.</w:t>
             </w:r>
           </w:p>
         </w:tc>
@@ -3832,7 +4326,13 @@
               <w:rPr>
                 <w:lang w:val="es"/>
               </w:rPr>
-              <w:t>El cliente muestra los movimientos recibidos, ordenados por número descendente, con cuenta, número, fecha, tipo, acción e importe.</w:t>
+              <w:t>El cliente muestra número, moneda y saldo de las</w:t>
+            </w:r>
+            <w:r>
+              <w:rPr>
+                <w:lang w:val="es"/>
+              </w:rPr>
+              <w:t xml:space="preserve"> cuentas devueltas.</w:t>
             </w:r>
           </w:p>
         </w:tc>
@@ -3842,8 +4342,8 @@
       <w:pPr>
         <w:pStyle w:val="Ttulo3"/>
       </w:pPr>
-      <w:bookmarkStart w:id="24" w:name="_51f32711f972b0b7da1ea3b91832eb5ae1a0d66"/>
-      <w:bookmarkStart w:id="25" w:name="_Toc243510799"/>
+      <w:bookmarkStart w:id="22" w:name="_51f32711f972b0b7da1ea3b91832eb5ae1a0d66"/>
+      <w:bookmarkStart w:id="23" w:name="_Toc244063270"/>
       <w:r>
         <w:rPr>
           <w:lang w:val="es"/>
@@ -3859,8 +4359,8 @@
         </w:rPr>
         <w:t>Flujo principal</w:t>
       </w:r>
-      <w:bookmarkEnd w:id="24"/>
-      <w:bookmarkEnd w:id="25"/>
+      <w:bookmarkEnd w:id="22"/>
+      <w:bookmarkEnd w:id="23"/>
     </w:p>
     <w:p>
       <w:pPr>
@@ -3873,7 +4373,7 @@
         <w:rPr>
           <w:lang w:val="es"/>
         </w:rPr>
-        <w:t>El cliente solicita el número de cuenta.</w:t>
+        <w:t>El cliente envía traerCuentas con el token.</w:t>
       </w:r>
     </w:p>
     <w:p>
@@ -3887,7 +4387,7 @@
         <w:rPr>
           <w:lang w:val="es"/>
         </w:rPr>
-        <w:t>El usuario ingresa la cuenta.</w:t>
+        <w:t>El servidor valida la sesión y obtiene el código de cliente asociado.</w:t>
       </w:r>
     </w:p>
     <w:p>
@@ -3901,7 +4401,8 @@
         <w:rPr>
           <w:lang w:val="es"/>
         </w:rPr>
-        <w:t>El cliente invoca traerMovimientos(cuenta).</w:t>
+        <w:lastRenderedPageBreak/>
+        <w:t>El DAO consulta las cuentas ACTIVO de ese cliente y las ordena por código.</w:t>
       </w:r>
     </w:p>
     <w:p>
@@ -3915,43 +4416,15 @@
         <w:rPr>
           <w:lang w:val="es"/>
         </w:rPr>
-        <w:t>El servicio valida el identificador y consulta la información de movimientos y sus tipos.</w:t>
-      </w:r>
-    </w:p>
-    <w:p>
-      <w:pPr>
-        <w:numPr>
-          <w:ilvl w:val="0"/>
-          <w:numId w:val="4"/>
-        </w:numPr>
-      </w:pPr>
-      <w:r>
-        <w:rPr>
-          <w:lang w:val="es"/>
-        </w:rPr>
-        <w:t>El servidor devuelve la lista ordenada por número de movimiento descendente.</w:t>
-      </w:r>
-    </w:p>
-    <w:p>
-      <w:pPr>
-        <w:numPr>
-          <w:ilvl w:val="0"/>
-          <w:numId w:val="4"/>
-        </w:numPr>
-      </w:pPr>
-      <w:r>
-        <w:rPr>
-          <w:lang w:val="es"/>
-        </w:rPr>
-        <w:t>El cliente presenta los datos de cada movimiento.</w:t>
+        <w:t>El cliente presenta la lista y permite seleccionar una cuenta para consultar movimientos u operar.</w:t>
       </w:r>
     </w:p>
     <w:p>
       <w:pPr>
         <w:pStyle w:val="Ttulo3"/>
       </w:pPr>
-      <w:bookmarkStart w:id="26" w:name="_9b75ec546b156cfd68cb196e5ad6090ba178914"/>
-      <w:bookmarkStart w:id="27" w:name="_Toc243510800"/>
+      <w:bookmarkStart w:id="24" w:name="_9b75ec546b156cfd68cb196e5ad6090ba178914"/>
+      <w:bookmarkStart w:id="25" w:name="_Toc244063271"/>
       <w:r>
         <w:rPr>
           <w:lang w:val="es"/>
@@ -3967,8 +4440,8 @@
         </w:rPr>
         <w:t>Flujos alternativos y excepciones</w:t>
       </w:r>
-      <w:bookmarkEnd w:id="26"/>
-      <w:bookmarkEnd w:id="27"/>
+      <w:bookmarkEnd w:id="24"/>
+      <w:bookmarkEnd w:id="25"/>
     </w:p>
     <w:p>
       <w:pPr>
@@ -3983,13 +4456,19 @@
           <w:bCs/>
           <w:lang w:val="es"/>
         </w:rPr>
-        <w:t>A1 — No hay movimientos:</w:t>
-      </w:r>
-      <w:r>
-        <w:rPr>
-          <w:lang w:val="es"/>
-        </w:rPr>
-        <w:t xml:space="preserve"> el servicio devuelve una lista vacía; el cliente informa que no hay movimientos para la consulta. La respuesta no permite distinguir una cuenta inexistente de una cuenta sin movimientos.</w:t>
+        <w:t>A1 — Token inválido, ausente o caducado:</w:t>
+      </w:r>
+      <w:r>
+        <w:rPr>
+          <w:lang w:val="es"/>
+        </w:rPr>
+        <w:t xml:space="preserve"> </w:t>
+      </w:r>
+      <w:r>
+        <w:rPr>
+          <w:lang w:val="es"/>
+        </w:rPr>
+        <w:t>el servicio rechaza la solicitud; el cliente retorna al ingreso.</w:t>
       </w:r>
     </w:p>
     <w:p>
@@ -4005,13 +4484,13 @@
           <w:bCs/>
           <w:lang w:val="es"/>
         </w:rPr>
-        <w:t>A2 — Cuenta vacía o de más de ocho caracteres:</w:t>
-      </w:r>
-      <w:r>
-        <w:rPr>
-          <w:lang w:val="es"/>
-        </w:rPr>
-        <w:t xml:space="preserve"> el servicio no realiza la consulta y devuelve una lista vacía. La interfaz Swing además limita el ingreso a entre uno y ocho dígitos; el cliente de consola solicita una cadena y delega al servicio las validaciones comunes.</w:t>
+        <w:t>A2 — El cliente no tiene cuentas activas:</w:t>
+      </w:r>
+      <w:r>
+        <w:rPr>
+          <w:lang w:val="es"/>
+        </w:rPr>
+        <w:t xml:space="preserve"> se devuelve una lista vacía.</w:t>
       </w:r>
     </w:p>
     <w:p>
@@ -4033,20 +4512,20 @@
         <w:rPr>
           <w:lang w:val="es"/>
         </w:rPr>
-        <w:t xml:space="preserve"> el servicio comunica el error como excepción SOAP; el cliente informa que no se pudo completar la consulta.</w:t>
-      </w:r>
-    </w:p>
-    <w:p>
-      <w:pPr>
-        <w:pStyle w:val="Ttulo3"/>
-      </w:pPr>
-      <w:bookmarkStart w:id="28" w:name="_24fe3affcd144e409b66c40e71b06415aa11a44"/>
-      <w:bookmarkStart w:id="29" w:name="_Toc243510801"/>
-      <w:r>
-        <w:rPr>
-          <w:lang w:val="es"/>
-        </w:rPr>
-        <w:t>5.2.3</w:t>
+        <w:t xml:space="preserve"> el cliente informa que no pudo cargar las cuentas.</w:t>
+      </w:r>
+    </w:p>
+    <w:p>
+      <w:pPr>
+        <w:pStyle w:val="Ttulo2"/>
+      </w:pPr>
+      <w:bookmarkStart w:id="26" w:name="_08d116b722aecf731e5bebe73168d2f76670884"/>
+      <w:bookmarkStart w:id="27" w:name="_Toc244063272"/>
+      <w:r>
+        <w:rPr>
+          <w:lang w:val="es"/>
+        </w:rPr>
+        <w:t>5.3</w:t>
       </w:r>
       <w:r>
         <w:tab/>
@@ -4055,48 +4534,10 @@
         <w:rPr>
           <w:lang w:val="es"/>
         </w:rPr>
-        <w:t>Datos de salida</w:t>
-      </w:r>
-      <w:bookmarkEnd w:id="28"/>
-      <w:bookmarkEnd w:id="29"/>
-    </w:p>
-    <w:p>
-      <w:r>
-        <w:rPr>
-          <w:lang w:val="es"/>
-        </w:rPr>
-        <w:t>Cada elemento contiene cuenta, número de movimiento, fecha, descripción del tipo, acción e importe. Los tipos y acciones se obtienen de las tablas Movimiento y TipoMovimiento.</w:t>
-      </w:r>
-    </w:p>
-    <w:p>
-      <w:r>
-        <w:br w:type="page"/>
-      </w:r>
-    </w:p>
-    <w:p>
-      <w:pPr>
-        <w:pStyle w:val="Ttulo2"/>
-      </w:pPr>
-      <w:bookmarkStart w:id="30" w:name="_8a885d25f88f43298a0e17c61a81b52bd5b60ac"/>
-      <w:bookmarkStart w:id="31" w:name="_Toc243510802"/>
-      <w:r>
-        <w:rPr>
-          <w:lang w:val="es"/>
-        </w:rPr>
-        <w:lastRenderedPageBreak/>
-        <w:t>5.3</w:t>
-      </w:r>
-      <w:r>
-        <w:tab/>
-      </w:r>
-      <w:r>
-        <w:rPr>
-          <w:lang w:val="es"/>
-        </w:rPr>
-        <w:t>CU-03 — Registrar depósito</w:t>
-      </w:r>
-      <w:bookmarkEnd w:id="30"/>
-      <w:bookmarkEnd w:id="31"/>
+        <w:t>CU-03 — Consultar movimientos</w:t>
+      </w:r>
+      <w:bookmarkEnd w:id="26"/>
+      <w:bookmarkEnd w:id="27"/>
     </w:p>
     <w:tbl>
       <w:tblPr>
@@ -4162,7 +4603,7 @@
               <w:rPr>
                 <w:lang w:val="es"/>
               </w:rPr>
-              <w:t>Usuario autorizado</w:t>
+              <w:t>Usuario</w:t>
             </w:r>
           </w:p>
         </w:tc>
@@ -4190,7 +4631,7 @@
               <w:rPr>
                 <w:lang w:val="es"/>
               </w:rPr>
-              <w:t>Acreditar un importe en una cuenta activa y registrar el movimiento correspondiente.</w:t>
+              <w:t>Presentar los movimientos de una cuenta activa del cliente autenticado.</w:t>
             </w:r>
           </w:p>
         </w:tc>
@@ -4218,7 +4659,7 @@
               <w:rPr>
                 <w:lang w:val="es"/>
               </w:rPr>
-              <w:t>El usuario selecciona “Registrar depósito”.</w:t>
+              <w:t>El usuario selecciona una cuenta y solicita su historial.</w:t>
             </w:r>
           </w:p>
         </w:tc>
@@ -4246,7 +4687,7 @@
               <w:rPr>
                 <w:lang w:val="es"/>
               </w:rPr>
-              <w:t>El usuario llegó al menú del cliente; la cuenta existe y está activa; el servicio y la base de datos están disponibles.</w:t>
+              <w:t>Hay token vigente; la cuenta pertenece al cliente y está activa.</w:t>
             </w:r>
           </w:p>
         </w:tc>
@@ -4274,7 +4715,7 @@
               <w:rPr>
                 <w:lang w:val="es"/>
               </w:rPr>
-              <w:t>El saldo y el contador de movimientos se actualizan y se registra un movimiento tipo depósito en una sola transacción. El servicio responde 1.</w:t>
+              <w:t>El cliente muestra movimientos por número descendente, con cuenta, número, fecha, tipo, acción e importe.</w:t>
             </w:r>
           </w:p>
         </w:tc>
@@ -4284,8 +4725,8 @@
       <w:pPr>
         <w:pStyle w:val="Ttulo3"/>
       </w:pPr>
-      <w:bookmarkStart w:id="32" w:name="_22d4acdc7616c25fdd8b32e7b7ce8d2b74add0e"/>
-      <w:bookmarkStart w:id="33" w:name="_Toc243510803"/>
+      <w:bookmarkStart w:id="28" w:name="_22d4acdc7616c25fdd8b32e7b7ce8d2b74add0e"/>
+      <w:bookmarkStart w:id="29" w:name="_Toc244063273"/>
       <w:r>
         <w:rPr>
           <w:lang w:val="es"/>
@@ -4301,8 +4742,8 @@
         </w:rPr>
         <w:t>Flujo principal</w:t>
       </w:r>
-      <w:bookmarkEnd w:id="32"/>
-      <w:bookmarkEnd w:id="33"/>
+      <w:bookmarkEnd w:id="28"/>
+      <w:bookmarkEnd w:id="29"/>
     </w:p>
     <w:p>
       <w:pPr>
@@ -4315,7 +4756,7 @@
         <w:rPr>
           <w:lang w:val="es"/>
         </w:rPr>
-        <w:t>El cliente solicita la cuenta y el importe.</w:t>
+        <w:t>El usuario selecciona una cuenta.</w:t>
       </w:r>
     </w:p>
     <w:p>
@@ -4329,7 +4770,13 @@
         <w:rPr>
           <w:lang w:val="es"/>
         </w:rPr>
-        <w:t>El usuario ingresa ambos datos.</w:t>
+        <w:t>El client</w:t>
+      </w:r>
+      <w:r>
+        <w:rPr>
+          <w:lang w:val="es"/>
+        </w:rPr>
+        <w:t>e invoca traerMovimientos con token y cuenta.</w:t>
       </w:r>
     </w:p>
     <w:p>
@@ -4343,7 +4790,7 @@
         <w:rPr>
           <w:lang w:val="es"/>
         </w:rPr>
-        <w:t>El cliente valida los datos que corresponden a su interfaz y llama regDeposito(cuenta, importe).</w:t>
+        <w:t>El servidor valida la sesión y las restricciones del identificador.</w:t>
       </w:r>
     </w:p>
     <w:p>
@@ -4357,7 +4804,7 @@
         <w:rPr>
           <w:lang w:val="es"/>
         </w:rPr>
-        <w:t>El servicio valida la cuenta y normaliza el importe a dos decimales sin redondear valores que excedan los centavos.</w:t>
+        <w:t>El DAO filtra por cuenta, cliente y estado ACTIVO.</w:t>
       </w:r>
     </w:p>
     <w:p>
@@ -4371,71 +4818,15 @@
         <w:rPr>
           <w:lang w:val="es"/>
         </w:rPr>
-        <w:t>El DAO inicia una transacción y bloquea la fila de la cuenta activa.</w:t>
-      </w:r>
-    </w:p>
-    <w:p>
-      <w:pPr>
-        <w:numPr>
-          <w:ilvl w:val="0"/>
-          <w:numId w:val="6"/>
-        </w:numPr>
-      </w:pPr>
-      <w:r>
-        <w:rPr>
-          <w:lang w:val="es"/>
-        </w:rPr>
-        <w:t>El DAO calcula el siguiente número de movimiento, suma el importe al saldo y aumenta el contador.</w:t>
-      </w:r>
-    </w:p>
-    <w:p>
-      <w:pPr>
-        <w:numPr>
-          <w:ilvl w:val="0"/>
-          <w:numId w:val="6"/>
-        </w:numPr>
-      </w:pPr>
-      <w:r>
-        <w:rPr>
-          <w:lang w:val="es"/>
-        </w:rPr>
-        <w:t>El DAO inserta el movimiento de depósito con tipo 003 y empleado técnico 0001.</w:t>
-      </w:r>
-    </w:p>
-    <w:p>
-      <w:pPr>
-        <w:numPr>
-          <w:ilvl w:val="0"/>
-          <w:numId w:val="6"/>
-        </w:numPr>
-      </w:pPr>
-      <w:r>
-        <w:rPr>
-          <w:lang w:val="es"/>
-        </w:rPr>
-        <w:t>El DAO confirma la transacción.</w:t>
-      </w:r>
-    </w:p>
-    <w:p>
-      <w:pPr>
-        <w:numPr>
-          <w:ilvl w:val="0"/>
-          <w:numId w:val="6"/>
-        </w:numPr>
-      </w:pPr>
-      <w:r>
-        <w:rPr>
-          <w:lang w:val="es"/>
-        </w:rPr>
-        <w:t>El servicio devuelve 1 y el cliente informa que el depósito se registró.</w:t>
+        <w:t>El cliente presenta los resultados.</w:t>
       </w:r>
     </w:p>
     <w:p>
       <w:pPr>
         <w:pStyle w:val="Ttulo3"/>
       </w:pPr>
-      <w:bookmarkStart w:id="34" w:name="_67dbd2d7929a28994b16928f39b0d6269395d30"/>
-      <w:bookmarkStart w:id="35" w:name="_Toc243510804"/>
+      <w:bookmarkStart w:id="30" w:name="_67dbd2d7929a28994b16928f39b0d6269395d30"/>
+      <w:bookmarkStart w:id="31" w:name="_Toc244063274"/>
       <w:r>
         <w:rPr>
           <w:lang w:val="es"/>
@@ -4451,8 +4842,8 @@
         </w:rPr>
         <w:t>Flujos alternativos y excepciones</w:t>
       </w:r>
-      <w:bookmarkEnd w:id="34"/>
-      <w:bookmarkEnd w:id="35"/>
+      <w:bookmarkEnd w:id="30"/>
+      <w:bookmarkEnd w:id="31"/>
     </w:p>
     <w:p>
       <w:pPr>
@@ -4467,13 +4858,21 @@
           <w:bCs/>
           <w:lang w:val="es"/>
         </w:rPr>
-        <w:t>A1 — Cuenta o importe inválido:</w:t>
-      </w:r>
-      <w:r>
-        <w:rPr>
-          <w:lang w:val="es"/>
-        </w:rPr>
-        <w:t xml:space="preserve"> una cuenta vacía, de más de ocho caracteres, un importe nulo, cero, negativo, con más de dos decimales no reducibles exactamente o con precisión superior a doce dígitos no se procesa. El servicio responde -1.</w:t>
+        <w:t>A1 — No hay mov</w:t>
+      </w:r>
+      <w:r>
+        <w:rPr>
+          <w:b/>
+          <w:bCs/>
+          <w:lang w:val="es"/>
+        </w:rPr>
+        <w:t>imientos o la cuenta no es accesible:</w:t>
+      </w:r>
+      <w:r>
+        <w:rPr>
+          <w:lang w:val="es"/>
+        </w:rPr>
+        <w:t xml:space="preserve"> se devuelve una lista vacía.</w:t>
       </w:r>
     </w:p>
     <w:p>
@@ -4489,13 +4888,13 @@
           <w:bCs/>
           <w:lang w:val="es"/>
         </w:rPr>
-        <w:t>A2 — Cuenta inexistente o inactiva:</w:t>
-      </w:r>
-      <w:r>
-        <w:rPr>
-          <w:lang w:val="es"/>
-        </w:rPr>
-        <w:t xml:space="preserve"> el DAO no obtiene una cuenta activa; la transacción se revierte y el servicio rechaza la solicitud.</w:t>
+        <w:t>A2 — Cuenta vacía o de más de ocho caracteres:</w:t>
+      </w:r>
+      <w:r>
+        <w:rPr>
+          <w:lang w:val="es"/>
+        </w:rPr>
+        <w:t xml:space="preserve"> el servicio no consulta y devuelve una lista vacía.</w:t>
       </w:r>
     </w:p>
     <w:p>
@@ -4511,13 +4910,19 @@
           <w:bCs/>
           <w:lang w:val="es"/>
         </w:rPr>
-        <w:t>A3 — Error al actualizar saldo o insertar movimiento:</w:t>
-      </w:r>
-      <w:r>
-        <w:rPr>
-          <w:lang w:val="es"/>
-        </w:rPr>
-        <w:t xml:space="preserve"> el DAO revierte la transacción. No debe quedar actualizado el saldo sin el movimiento correspondiente.</w:t>
+        <w:t>A3 — Token inválido o vencido:</w:t>
+      </w:r>
+      <w:r>
+        <w:rPr>
+          <w:lang w:val="es"/>
+        </w:rPr>
+        <w:t xml:space="preserve"> el servicio comunica un error SOAP y el cliente vuelve al i</w:t>
+      </w:r>
+      <w:r>
+        <w:rPr>
+          <w:lang w:val="es"/>
+        </w:rPr>
+        <w:t>ngreso.</w:t>
       </w:r>
     </w:p>
     <w:p>
@@ -4533,26 +4938,26 @@
           <w:bCs/>
           <w:lang w:val="es"/>
         </w:rPr>
-        <w:t>A4 — Resultado de red incierto:</w:t>
-      </w:r>
-      <w:r>
-        <w:rPr>
-          <w:lang w:val="es"/>
-        </w:rPr>
-        <w:t xml:space="preserve"> el cliente puede no recibir la respuesta aunque el servidor haya confirmado el depósito. El cliente de escritorio indica consultar movimientos antes de repetir la operación; no se reintenta automáticamente.</w:t>
-      </w:r>
-    </w:p>
-    <w:p>
-      <w:pPr>
-        <w:pStyle w:val="Ttulo3"/>
-      </w:pPr>
-      <w:bookmarkStart w:id="36" w:name="_db98f23a1b2b67ecff6fb710d61164ccbf28b51"/>
-      <w:bookmarkStart w:id="37" w:name="_Toc243510805"/>
-      <w:r>
-        <w:rPr>
-          <w:lang w:val="es"/>
-        </w:rPr>
-        <w:t>5.3.3</w:t>
+        <w:t>A4 — Error de base de datos o SOAP:</w:t>
+      </w:r>
+      <w:r>
+        <w:rPr>
+          <w:lang w:val="es"/>
+        </w:rPr>
+        <w:t xml:space="preserve"> el cliente informa que no pudo completar la consulta.</w:t>
+      </w:r>
+    </w:p>
+    <w:p>
+      <w:pPr>
+        <w:pStyle w:val="Ttulo2"/>
+      </w:pPr>
+      <w:bookmarkStart w:id="32" w:name="_e9057b9445184a6ae70215278f542aa15912fdf"/>
+      <w:bookmarkStart w:id="33" w:name="_Toc244063275"/>
+      <w:r>
+        <w:rPr>
+          <w:lang w:val="es"/>
+        </w:rPr>
+        <w:t>5.4</w:t>
       </w:r>
       <w:r>
         <w:tab/>
@@ -4561,43 +4966,10 @@
         <w:rPr>
           <w:lang w:val="es"/>
         </w:rPr>
-        <w:t>Variación por cliente</w:t>
-      </w:r>
-      <w:bookmarkEnd w:id="36"/>
-      <w:bookmarkEnd w:id="37"/>
-    </w:p>
-    <w:p>
-      <w:r>
-        <w:rPr>
-          <w:lang w:val="es"/>
-        </w:rPr>
-        <w:lastRenderedPageBreak/>
-        <w:t>El escritorio limita la cuenta a ocho dígitos, admite importes de 0,01 a 9.999.999.999,99 y deshabilita el envío mientras espera. La consola interpreta el importe como decimal; el servicio aplica las reglas finales.</w:t>
-      </w:r>
-    </w:p>
-    <w:p>
-      <w:pPr>
-        <w:pStyle w:val="Ttulo2"/>
-      </w:pPr>
-      <w:bookmarkStart w:id="38" w:name="_e683241b1c95401ac831d5cde62c028fb2c0b22"/>
-      <w:bookmarkStart w:id="39" w:name="_Toc243510806"/>
-      <w:r>
-        <w:rPr>
-          <w:lang w:val="es"/>
-        </w:rPr>
-        <w:t>5.4</w:t>
-      </w:r>
-      <w:r>
-        <w:tab/>
-      </w:r>
-      <w:r>
-        <w:rPr>
-          <w:lang w:val="es"/>
-        </w:rPr>
-        <w:t>CU-04 — Cerrar sesión local</w:t>
-      </w:r>
-      <w:bookmarkEnd w:id="38"/>
-      <w:bookmarkEnd w:id="39"/>
+        <w:t>CU-04 — Registrar depósito</w:t>
+      </w:r>
+      <w:bookmarkEnd w:id="32"/>
+      <w:bookmarkEnd w:id="33"/>
     </w:p>
     <w:tbl>
       <w:tblPr>
@@ -4622,6 +4994,7 @@
               <w:rPr>
                 <w:lang w:val="es"/>
               </w:rPr>
+              <w:lastRenderedPageBreak/>
               <w:t>Campo</w:t>
             </w:r>
           </w:p>
@@ -4663,7 +5036,7 @@
               <w:rPr>
                 <w:lang w:val="es"/>
               </w:rPr>
-              <w:t>Usuario autorizado</w:t>
+              <w:t>Usuario</w:t>
             </w:r>
           </w:p>
         </w:tc>
@@ -4691,7 +5064,7 @@
               <w:rPr>
                 <w:lang w:val="es"/>
               </w:rPr>
-              <w:t>Salir del menú para finalizar el uso local del cliente.</w:t>
+              <w:t>Acreditar dinero en una cuenta activa propia y registrar el movimiento.</w:t>
             </w:r>
           </w:p>
         </w:tc>
@@ -4719,7 +5092,7 @@
               <w:rPr>
                 <w:lang w:val="es"/>
               </w:rPr>
-              <w:t>El usuario selecciona “Cerrar sesión” o salir.</w:t>
+              <w:t>El usuario selecciona registrar depósito.</w:t>
             </w:r>
           </w:p>
         </w:tc>
@@ -4747,7 +5120,7 @@
               <w:rPr>
                 <w:lang w:val="es"/>
               </w:rPr>
-              <w:t>El usuario está en el menú local del cliente.</w:t>
+              <w:t>Token vigente; cuenta del cliente en estado ACTIVO.</w:t>
             </w:r>
           </w:p>
         </w:tc>
@@ -4762,7 +5135,7 @@
               <w:rPr>
                 <w:lang w:val="es"/>
               </w:rPr>
-              <w:t>Resultado</w:t>
+              <w:t>Resultado exitoso</w:t>
             </w:r>
           </w:p>
         </w:tc>
@@ -4775,7 +5148,13 @@
               <w:rPr>
                 <w:lang w:val="es"/>
               </w:rPr>
-              <w:t>El cliente vuelve a la pantalla de ingreso o termina su ejecución. El servidor no recibe una petición de cierre de sesión.</w:t>
+              <w:t xml:space="preserve">Se actualizan saldo, contador y movimiento </w:t>
+            </w:r>
+            <w:r>
+              <w:rPr>
+                <w:lang w:val="es"/>
+              </w:rPr>
+              <w:t>tipo 003 en una transacción; el servicio responde 1.</w:t>
             </w:r>
           </w:p>
         </w:tc>
@@ -4785,8 +5164,8 @@
       <w:pPr>
         <w:pStyle w:val="Ttulo3"/>
       </w:pPr>
-      <w:bookmarkStart w:id="40" w:name="_f68060827827a233488cb2d4ea287c3de93ceba"/>
-      <w:bookmarkStart w:id="41" w:name="_Toc243510807"/>
+      <w:bookmarkStart w:id="34" w:name="_f68060827827a233488cb2d4ea287c3de93ceba"/>
+      <w:bookmarkStart w:id="35" w:name="_Toc244063276"/>
       <w:r>
         <w:rPr>
           <w:lang w:val="es"/>
@@ -4802,8 +5181,8 @@
         </w:rPr>
         <w:t>Flujo principal</w:t>
       </w:r>
-      <w:bookmarkEnd w:id="40"/>
-      <w:bookmarkEnd w:id="41"/>
+      <w:bookmarkEnd w:id="34"/>
+      <w:bookmarkEnd w:id="35"/>
     </w:p>
     <w:p>
       <w:pPr>
@@ -4816,7 +5195,7 @@
         <w:rPr>
           <w:lang w:val="es"/>
         </w:rPr>
-        <w:t>El usuario selecciona la opción de salida.</w:t>
+        <w:t>El cliente solicita cuenta e importe.</w:t>
       </w:r>
     </w:p>
     <w:p>
@@ -4830,7 +5209,7 @@
         <w:rPr>
           <w:lang w:val="es"/>
         </w:rPr>
-        <w:t>El cliente limpia su estado local de autenticación, cuando ese estado se mantiene en memoria.</w:t>
+        <w:t>El usuario ingresa y revisa los datos.</w:t>
       </w:r>
     </w:p>
     <w:p>
@@ -4844,15 +5223,203 @@
         <w:rPr>
           <w:lang w:val="es"/>
         </w:rPr>
-        <w:t>El cliente de escritorio retorna a la pantalla de ingreso; el cliente de consola termina el ciclo del menú y su ejecución.</w:t>
+        <w:t>El adaptador invoca regDeposito con token, cuenta e importe.</w:t>
+      </w:r>
+    </w:p>
+    <w:p>
+      <w:pPr>
+        <w:numPr>
+          <w:ilvl w:val="0"/>
+          <w:numId w:val="8"/>
+        </w:numPr>
+      </w:pPr>
+      <w:r>
+        <w:rPr>
+          <w:lang w:val="es"/>
+        </w:rPr>
+        <w:t>El servicio valida token, cuenta e importe positivo, exacto a dos decimales y de hasta doce dígitos.</w:t>
+      </w:r>
+    </w:p>
+    <w:p>
+      <w:pPr>
+        <w:numPr>
+          <w:ilvl w:val="0"/>
+          <w:numId w:val="8"/>
+        </w:numPr>
+      </w:pPr>
+      <w:r>
+        <w:rPr>
+          <w:lang w:val="es"/>
+        </w:rPr>
+        <w:t>El DAO bloquea la cuenta del cliente y determina el siguiente número de movimiento.</w:t>
+      </w:r>
+    </w:p>
+    <w:p>
+      <w:pPr>
+        <w:numPr>
+          <w:ilvl w:val="0"/>
+          <w:numId w:val="8"/>
+        </w:numPr>
+      </w:pPr>
+      <w:r>
+        <w:rPr>
+          <w:lang w:val="es"/>
+        </w:rPr>
+        <w:t>El DAO actualiza saldo y contador, inserta el movimiento tipo 003 con e</w:t>
+      </w:r>
+      <w:r>
+        <w:rPr>
+          <w:lang w:val="es"/>
+        </w:rPr>
+        <w:t>mpleado fijo 0001 y confirma la transacción.</w:t>
+      </w:r>
+    </w:p>
+    <w:p>
+      <w:pPr>
+        <w:numPr>
+          <w:ilvl w:val="0"/>
+          <w:numId w:val="8"/>
+        </w:numPr>
+      </w:pPr>
+      <w:r>
+        <w:rPr>
+          <w:lang w:val="es"/>
+        </w:rPr>
+        <w:t>El cliente presenta el resultado confirmado.</w:t>
+      </w:r>
+    </w:p>
+    <w:p>
+      <w:pPr>
+        <w:pStyle w:val="Ttulo3"/>
+      </w:pPr>
+      <w:bookmarkStart w:id="36" w:name="_b2205ea99d21ae7dd234becbb266c51382d8eac"/>
+      <w:bookmarkStart w:id="37" w:name="_Toc244063277"/>
+      <w:r>
+        <w:rPr>
+          <w:lang w:val="es"/>
+        </w:rPr>
+        <w:t>5.4.2</w:t>
+      </w:r>
+      <w:r>
+        <w:tab/>
+      </w:r>
+      <w:r>
+        <w:rPr>
+          <w:lang w:val="es"/>
+        </w:rPr>
+        <w:t>Flujos alternativos y excepciones</w:t>
+      </w:r>
+      <w:bookmarkEnd w:id="36"/>
+      <w:bookmarkEnd w:id="37"/>
+    </w:p>
+    <w:p>
+      <w:pPr>
+        <w:numPr>
+          <w:ilvl w:val="0"/>
+          <w:numId w:val="9"/>
+        </w:numPr>
+      </w:pPr>
+      <w:r>
+        <w:rPr>
+          <w:b/>
+          <w:bCs/>
+          <w:lang w:val="es"/>
+        </w:rPr>
+        <w:t>A1 — Cuenta o importe inválido:</w:t>
+      </w:r>
+      <w:r>
+        <w:rPr>
+          <w:lang w:val="es"/>
+        </w:rPr>
+        <w:t xml:space="preserve"> el servicio rechaza con -1 sin actualizar la cuenta.</w:t>
+      </w:r>
+    </w:p>
+    <w:p>
+      <w:pPr>
+        <w:numPr>
+          <w:ilvl w:val="0"/>
+          <w:numId w:val="9"/>
+        </w:numPr>
+      </w:pPr>
+      <w:r>
+        <w:rPr>
+          <w:b/>
+          <w:bCs/>
+          <w:lang w:val="es"/>
+        </w:rPr>
+        <w:t>A2 — Cuenta inexistente, inactiva o de ot</w:t>
+      </w:r>
+      <w:r>
+        <w:rPr>
+          <w:b/>
+          <w:bCs/>
+          <w:lang w:val="es"/>
+        </w:rPr>
+        <w:t>ro cliente:</w:t>
+      </w:r>
+      <w:r>
+        <w:rPr>
+          <w:lang w:val="es"/>
+        </w:rPr>
+        <w:t xml:space="preserve"> el DAO revierte la transacción y el servicio rechaza.</w:t>
+      </w:r>
+    </w:p>
+    <w:p>
+      <w:pPr>
+        <w:numPr>
+          <w:ilvl w:val="0"/>
+          <w:numId w:val="9"/>
+        </w:numPr>
+      </w:pPr>
+      <w:r>
+        <w:rPr>
+          <w:b/>
+          <w:bCs/>
+          <w:lang w:val="es"/>
+        </w:rPr>
+        <w:t>A3 — Error antes del commit:</w:t>
+      </w:r>
+      <w:r>
+        <w:rPr>
+          <w:lang w:val="es"/>
+        </w:rPr>
+        <w:t xml:space="preserve"> el DAO ejecuta rollback; no queda saldo actualizado sin movimiento.</w:t>
+      </w:r>
+    </w:p>
+    <w:p>
+      <w:pPr>
+        <w:numPr>
+          <w:ilvl w:val="0"/>
+          <w:numId w:val="9"/>
+        </w:numPr>
+      </w:pPr>
+      <w:r>
+        <w:rPr>
+          <w:b/>
+          <w:bCs/>
+          <w:lang w:val="es"/>
+        </w:rPr>
+        <w:t>A4 — Respuesta perdida después del commit:</w:t>
+      </w:r>
+      <w:r>
+        <w:rPr>
+          <w:lang w:val="es"/>
+        </w:rPr>
+        <w:t xml:space="preserve"> el depósito puede haberse aplicado. No hay clave i</w:t>
+      </w:r>
+      <w:r>
+        <w:rPr>
+          <w:lang w:val="es"/>
+        </w:rPr>
+        <w:t>dempotente; el operador consulta movimientos antes de decidir si repite.</w:t>
       </w:r>
     </w:p>
     <w:p>
       <w:pPr>
         <w:pStyle w:val="Ttulo2"/>
       </w:pPr>
-      <w:bookmarkStart w:id="42" w:name="_4322009eddb45a9a865d6274dada7de61146cef"/>
-      <w:bookmarkStart w:id="43" w:name="_Toc243510808"/>
+      <w:bookmarkStart w:id="38" w:name="_dc2fcf676c44b1cb2c4adba0e76b8b7ad7871c8"/>
+      <w:bookmarkStart w:id="39" w:name="_Toc244063278"/>
       <w:r>
         <w:rPr>
           <w:lang w:val="es"/>
@@ -4866,10 +5433,967 @@
         <w:rPr>
           <w:lang w:val="es"/>
         </w:rPr>
-        <w:t>Casos incluidos</w:t>
+        <w:t>CU-05 — Transferir fondos</w:t>
+      </w:r>
+      <w:bookmarkEnd w:id="38"/>
+      <w:bookmarkEnd w:id="39"/>
+    </w:p>
+    <w:tbl>
+      <w:tblPr>
+        <w:tblW w:w="5000" w:type="pct"/>
+        <w:tblLayout w:type="fixed"/>
+        <w:tblLook w:val="0020" w:firstRow="1" w:lastRow="0" w:firstColumn="0" w:lastColumn="0" w:noHBand="0" w:noVBand="0"/>
+      </w:tblPr>
+      <w:tblGrid>
+        <w:gridCol w:w="4252"/>
+        <w:gridCol w:w="4252"/>
+      </w:tblGrid>
+      <w:tr>
+        <w:trPr>
+          <w:tblHeader/>
+        </w:trPr>
+        <w:tc>
+          <w:tcPr>
+            <w:tcW w:w="3960" w:type="dxa"/>
+          </w:tcPr>
+          <w:p>
+            <w:r>
+              <w:rPr>
+                <w:lang w:val="es"/>
+              </w:rPr>
+              <w:t>Campo</w:t>
+            </w:r>
+          </w:p>
+        </w:tc>
+        <w:tc>
+          <w:tcPr>
+            <w:tcW w:w="3960" w:type="dxa"/>
+          </w:tcPr>
+          <w:p>
+            <w:r>
+              <w:rPr>
+                <w:lang w:val="es"/>
+              </w:rPr>
+              <w:t>Descripción</w:t>
+            </w:r>
+          </w:p>
+        </w:tc>
+      </w:tr>
+      <w:tr>
+        <w:tc>
+          <w:tcPr>
+            <w:tcW w:w="3960" w:type="dxa"/>
+          </w:tcPr>
+          <w:p>
+            <w:r>
+              <w:rPr>
+                <w:lang w:val="es"/>
+              </w:rPr>
+              <w:t>Actor principal</w:t>
+            </w:r>
+          </w:p>
+        </w:tc>
+        <w:tc>
+          <w:tcPr>
+            <w:tcW w:w="3960" w:type="dxa"/>
+          </w:tcPr>
+          <w:p>
+            <w:r>
+              <w:rPr>
+                <w:lang w:val="es"/>
+              </w:rPr>
+              <w:t>Usuario</w:t>
+            </w:r>
+          </w:p>
+        </w:tc>
+      </w:tr>
+      <w:tr>
+        <w:tc>
+          <w:tcPr>
+            <w:tcW w:w="3960" w:type="dxa"/>
+          </w:tcPr>
+          <w:p>
+            <w:r>
+              <w:rPr>
+                <w:lang w:val="es"/>
+              </w:rPr>
+              <w:t>Propósito</w:t>
+            </w:r>
+          </w:p>
+        </w:tc>
+        <w:tc>
+          <w:tcPr>
+            <w:tcW w:w="3960" w:type="dxa"/>
+          </w:tcPr>
+          <w:p>
+            <w:r>
+              <w:rPr>
+                <w:lang w:val="es"/>
+              </w:rPr>
+              <w:t>Transferir un importe entre dos cuentas activas.</w:t>
+            </w:r>
+          </w:p>
+        </w:tc>
+      </w:tr>
+      <w:tr>
+        <w:tc>
+          <w:tcPr>
+            <w:tcW w:w="3960" w:type="dxa"/>
+          </w:tcPr>
+          <w:p>
+            <w:r>
+              <w:rPr>
+                <w:lang w:val="es"/>
+              </w:rPr>
+              <w:t>Disparador</w:t>
+            </w:r>
+          </w:p>
+        </w:tc>
+        <w:tc>
+          <w:tcPr>
+            <w:tcW w:w="3960" w:type="dxa"/>
+          </w:tcPr>
+          <w:p>
+            <w:r>
+              <w:rPr>
+                <w:lang w:val="es"/>
+              </w:rPr>
+              <w:t>El usuario selecciona transferir e ingresa origen, destino e importe.</w:t>
+            </w:r>
+          </w:p>
+        </w:tc>
+      </w:tr>
+      <w:tr>
+        <w:tc>
+          <w:tcPr>
+            <w:tcW w:w="3960" w:type="dxa"/>
+          </w:tcPr>
+          <w:p>
+            <w:r>
+              <w:rPr>
+                <w:lang w:val="es"/>
+              </w:rPr>
+              <w:t>Precondiciones</w:t>
+            </w:r>
+          </w:p>
+        </w:tc>
+        <w:tc>
+          <w:tcPr>
+            <w:tcW w:w="3960" w:type="dxa"/>
+          </w:tcPr>
+          <w:p>
+            <w:r>
+              <w:rPr>
+                <w:lang w:val="es"/>
+              </w:rPr>
+              <w:t xml:space="preserve">Token vigente; ambas cuentas están activas; </w:t>
+            </w:r>
+            <w:r>
+              <w:rPr>
+                <w:lang w:val="es"/>
+              </w:rPr>
+              <w:lastRenderedPageBreak/>
+              <w:t>el origen pertenece al cliente autenticado.</w:t>
+            </w:r>
+          </w:p>
+        </w:tc>
+      </w:tr>
+      <w:tr>
+        <w:tc>
+          <w:tcPr>
+            <w:tcW w:w="3960" w:type="dxa"/>
+          </w:tcPr>
+          <w:p>
+            <w:r>
+              <w:rPr>
+                <w:lang w:val="es"/>
+              </w:rPr>
+              <w:lastRenderedPageBreak/>
+              <w:t>Resultado exitoso</w:t>
+            </w:r>
+          </w:p>
+        </w:tc>
+        <w:tc>
+          <w:tcPr>
+            <w:tcW w:w="3960" w:type="dxa"/>
+          </w:tcPr>
+          <w:p>
+            <w:r>
+              <w:rPr>
+                <w:lang w:val="es"/>
+              </w:rPr>
+              <w:t>Se debita origen y se acredita destino en una transacción; se r</w:t>
+            </w:r>
+            <w:r>
+              <w:rPr>
+                <w:lang w:val="es"/>
+              </w:rPr>
+              <w:t>egistran dos movimientos y se devuelve 1.</w:t>
+            </w:r>
+          </w:p>
+        </w:tc>
+      </w:tr>
+    </w:tbl>
+    <w:p>
+      <w:pPr>
+        <w:pStyle w:val="Ttulo3"/>
+      </w:pPr>
+      <w:bookmarkStart w:id="40" w:name="_ec491eeb8b969c5a2b3e4d25c0944ce5b3729c7"/>
+      <w:bookmarkStart w:id="41" w:name="_Toc244063279"/>
+      <w:r>
+        <w:rPr>
+          <w:lang w:val="es"/>
+        </w:rPr>
+        <w:t>5.5.1</w:t>
+      </w:r>
+      <w:r>
+        <w:tab/>
+      </w:r>
+      <w:r>
+        <w:rPr>
+          <w:lang w:val="es"/>
+        </w:rPr>
+        <w:t>Flujo principal</w:t>
+      </w:r>
+      <w:bookmarkEnd w:id="40"/>
+      <w:bookmarkEnd w:id="41"/>
+    </w:p>
+    <w:p>
+      <w:pPr>
+        <w:numPr>
+          <w:ilvl w:val="0"/>
+          <w:numId w:val="10"/>
+        </w:numPr>
+      </w:pPr>
+      <w:r>
+        <w:rPr>
+          <w:lang w:val="es"/>
+        </w:rPr>
+        <w:t>El cliente solicita origen, destino e importe.</w:t>
+      </w:r>
+    </w:p>
+    <w:p>
+      <w:pPr>
+        <w:numPr>
+          <w:ilvl w:val="0"/>
+          <w:numId w:val="10"/>
+        </w:numPr>
+      </w:pPr>
+      <w:r>
+        <w:rPr>
+          <w:lang w:val="es"/>
+        </w:rPr>
+        <w:t>El usuario ingresa cuentas distintas de ocho dígitos e importe positivo exacto a centavos, no mayor a 9.999.999.999,99.</w:t>
+      </w:r>
+    </w:p>
+    <w:p>
+      <w:pPr>
+        <w:numPr>
+          <w:ilvl w:val="0"/>
+          <w:numId w:val="10"/>
+        </w:numPr>
+      </w:pPr>
+      <w:r>
+        <w:rPr>
+          <w:lang w:val="es"/>
+        </w:rPr>
+        <w:t>El cliente genera una cl</w:t>
+      </w:r>
+      <w:r>
+        <w:rPr>
+          <w:lang w:val="es"/>
+        </w:rPr>
+        <w:t>ave UUID para la solicitud y la envía junto al token.</w:t>
+      </w:r>
+    </w:p>
+    <w:p>
+      <w:pPr>
+        <w:numPr>
+          <w:ilvl w:val="0"/>
+          <w:numId w:val="10"/>
+        </w:numPr>
+      </w:pPr>
+      <w:r>
+        <w:rPr>
+          <w:lang w:val="es"/>
+        </w:rPr>
+        <w:t>El servicio valida token, cuentas, importe y formato de clave.</w:t>
+      </w:r>
+    </w:p>
+    <w:p>
+      <w:pPr>
+        <w:numPr>
+          <w:ilvl w:val="0"/>
+          <w:numId w:val="10"/>
+        </w:numPr>
+      </w:pPr>
+      <w:r>
+        <w:rPr>
+          <w:lang w:val="es"/>
+        </w:rPr>
+        <w:t>El DAO busca primero una transferencia previa del mismo usuario con esa clave.</w:t>
+      </w:r>
+    </w:p>
+    <w:p>
+      <w:pPr>
+        <w:numPr>
+          <w:ilvl w:val="0"/>
+          <w:numId w:val="10"/>
+        </w:numPr>
+      </w:pPr>
+      <w:r>
+        <w:rPr>
+          <w:lang w:val="es"/>
+        </w:rPr>
+        <w:t>Si no es repetida, el DAO bloquea las cuentas por código par</w:t>
+      </w:r>
+      <w:r>
+        <w:rPr>
+          <w:lang w:val="es"/>
+        </w:rPr>
+        <w:t>a mantener un orden estable.</w:t>
+      </w:r>
+    </w:p>
+    <w:p>
+      <w:pPr>
+        <w:numPr>
+          <w:ilvl w:val="0"/>
+          <w:numId w:val="10"/>
+        </w:numPr>
+      </w:pPr>
+      <w:r>
+        <w:rPr>
+          <w:lang w:val="es"/>
+        </w:rPr>
+        <w:t>El DAO verifica que ambas cuentas estén activas, que tengan la misma moneda, que el origen sea del cliente autenticado y tenga saldo suficiente.</w:t>
+      </w:r>
+    </w:p>
+    <w:p>
+      <w:pPr>
+        <w:numPr>
+          <w:ilvl w:val="0"/>
+          <w:numId w:val="10"/>
+        </w:numPr>
+      </w:pPr>
+      <w:r>
+        <w:rPr>
+          <w:lang w:val="es"/>
+        </w:rPr>
+        <w:t>El DAO registra la transferencia, actualiza ambos saldos y contadores, inserta déb</w:t>
+      </w:r>
+      <w:r>
+        <w:rPr>
+          <w:lang w:val="es"/>
+        </w:rPr>
+        <w:t>ito tipo 009 y crédito tipo 008 y confirma la transacción.</w:t>
+      </w:r>
+    </w:p>
+    <w:p>
+      <w:pPr>
+        <w:numPr>
+          <w:ilvl w:val="0"/>
+          <w:numId w:val="10"/>
+        </w:numPr>
+      </w:pPr>
+      <w:r>
+        <w:rPr>
+          <w:lang w:val="es"/>
+        </w:rPr>
+        <w:t>El cliente presenta el resultado.</w:t>
+      </w:r>
+    </w:p>
+    <w:p>
+      <w:pPr>
+        <w:pStyle w:val="Ttulo3"/>
+      </w:pPr>
+      <w:bookmarkStart w:id="42" w:name="_11055ddece7cd47674a9c05052d5b9b7630a844"/>
+      <w:bookmarkStart w:id="43" w:name="_Toc244063280"/>
+      <w:r>
+        <w:rPr>
+          <w:lang w:val="es"/>
+        </w:rPr>
+        <w:t>5.5.2</w:t>
+      </w:r>
+      <w:r>
+        <w:tab/>
+      </w:r>
+      <w:r>
+        <w:rPr>
+          <w:lang w:val="es"/>
+        </w:rPr>
+        <w:t>Flujos alternativos y excepciones</w:t>
       </w:r>
       <w:bookmarkEnd w:id="42"/>
       <w:bookmarkEnd w:id="43"/>
+    </w:p>
+    <w:p>
+      <w:pPr>
+        <w:numPr>
+          <w:ilvl w:val="0"/>
+          <w:numId w:val="11"/>
+        </w:numPr>
+      </w:pPr>
+      <w:r>
+        <w:rPr>
+          <w:b/>
+          <w:bCs/>
+          <w:lang w:val="es"/>
+        </w:rPr>
+        <w:t>A1 — Token inválido o vencido:</w:t>
+      </w:r>
+      <w:r>
+        <w:rPr>
+          <w:lang w:val="es"/>
+        </w:rPr>
+        <w:t xml:space="preserve"> el servicio rechaza la solicitud.</w:t>
+      </w:r>
+    </w:p>
+    <w:p>
+      <w:pPr>
+        <w:numPr>
+          <w:ilvl w:val="0"/>
+          <w:numId w:val="11"/>
+        </w:numPr>
+      </w:pPr>
+      <w:r>
+        <w:rPr>
+          <w:b/>
+          <w:bCs/>
+          <w:lang w:val="es"/>
+        </w:rPr>
+        <w:t>A2 — Datos inválidos, cuentas iguales o clave no UUID:</w:t>
+      </w:r>
+      <w:r>
+        <w:rPr>
+          <w:lang w:val="es"/>
+        </w:rPr>
+        <w:t xml:space="preserve"> el </w:t>
+      </w:r>
+      <w:r>
+        <w:rPr>
+          <w:lang w:val="es"/>
+        </w:rPr>
+        <w:t>servicio devuelve -1.</w:t>
+      </w:r>
+    </w:p>
+    <w:p>
+      <w:pPr>
+        <w:numPr>
+          <w:ilvl w:val="0"/>
+          <w:numId w:val="11"/>
+        </w:numPr>
+      </w:pPr>
+      <w:r>
+        <w:rPr>
+          <w:b/>
+          <w:bCs/>
+          <w:lang w:val="es"/>
+        </w:rPr>
+        <w:t>A3 — Cuenta inactiva, origen ajeno, moneda distinta o saldo insuficiente:</w:t>
+      </w:r>
+      <w:r>
+        <w:rPr>
+          <w:lang w:val="es"/>
+        </w:rPr>
+        <w:t xml:space="preserve"> el DAO revierte y devuelve rechazo.</w:t>
+      </w:r>
+    </w:p>
+    <w:p>
+      <w:pPr>
+        <w:numPr>
+          <w:ilvl w:val="0"/>
+          <w:numId w:val="11"/>
+        </w:numPr>
+      </w:pPr>
+      <w:r>
+        <w:rPr>
+          <w:b/>
+          <w:bCs/>
+          <w:lang w:val="es"/>
+        </w:rPr>
+        <w:t>A4 — Reintento con la misma clave y los mismos datos:</w:t>
+      </w:r>
+      <w:r>
+        <w:rPr>
+          <w:lang w:val="es"/>
+        </w:rPr>
+        <w:t xml:space="preserve"> </w:t>
+      </w:r>
+      <w:r>
+        <w:rPr>
+          <w:lang w:val="es"/>
+        </w:rPr>
+        <w:t>el servidor reconoce la solicitud y no duplica la transferencia.</w:t>
+      </w:r>
+    </w:p>
+    <w:p>
+      <w:pPr>
+        <w:numPr>
+          <w:ilvl w:val="0"/>
+          <w:numId w:val="11"/>
+        </w:numPr>
+      </w:pPr>
+      <w:r>
+        <w:rPr>
+          <w:b/>
+          <w:bCs/>
+          <w:lang w:val="es"/>
+        </w:rPr>
+        <w:t>A5 — Reutilización de la clave con datos distintos:</w:t>
+      </w:r>
+      <w:r>
+        <w:rPr>
+          <w:lang w:val="es"/>
+        </w:rPr>
+        <w:t xml:space="preserve"> el servidor rechaza la solicitud.</w:t>
+      </w:r>
+    </w:p>
+    <w:p>
+      <w:pPr>
+        <w:numPr>
+          <w:ilvl w:val="0"/>
+          <w:numId w:val="11"/>
+        </w:numPr>
+      </w:pPr>
+      <w:r>
+        <w:rPr>
+          <w:b/>
+          <w:bCs/>
+          <w:lang w:val="es"/>
+        </w:rPr>
+        <w:t>A6 — Error durante los cambios bancarios:</w:t>
+      </w:r>
+      <w:r>
+        <w:rPr>
+          <w:lang w:val="es"/>
+        </w:rPr>
+        <w:t xml:space="preserve"> el DAO ejecuta rollback; no queda solo el débito o solo el créd</w:t>
+      </w:r>
+      <w:r>
+        <w:rPr>
+          <w:lang w:val="es"/>
+        </w:rPr>
+        <w:t>ito.</w:t>
+      </w:r>
+    </w:p>
+    <w:p>
+      <w:pPr>
+        <w:numPr>
+          <w:ilvl w:val="0"/>
+          <w:numId w:val="11"/>
+        </w:numPr>
+      </w:pPr>
+      <w:r>
+        <w:rPr>
+          <w:b/>
+          <w:bCs/>
+          <w:lang w:val="es"/>
+        </w:rPr>
+        <w:t>A7 — Respuesta perdida:</w:t>
+      </w:r>
+      <w:r>
+        <w:rPr>
+          <w:lang w:val="es"/>
+        </w:rPr>
+        <w:t xml:space="preserve"> el consumidor conserva y reutiliza la misma clave y datos para resolver el resultado.</w:t>
+      </w:r>
+    </w:p>
+    <w:p>
+      <w:pPr>
+        <w:pStyle w:val="Ttulo2"/>
+      </w:pPr>
+      <w:bookmarkStart w:id="44" w:name="_12d98e64f98e51133fd14221222e18ae9526528"/>
+      <w:bookmarkStart w:id="45" w:name="_Toc244063281"/>
+      <w:r>
+        <w:rPr>
+          <w:lang w:val="es"/>
+        </w:rPr>
+        <w:t>5.6</w:t>
+      </w:r>
+      <w:r>
+        <w:tab/>
+      </w:r>
+      <w:r>
+        <w:rPr>
+          <w:lang w:val="es"/>
+        </w:rPr>
+        <w:t>CU-06 — Cerrar sesión</w:t>
+      </w:r>
+      <w:bookmarkEnd w:id="44"/>
+      <w:bookmarkEnd w:id="45"/>
+    </w:p>
+    <w:tbl>
+      <w:tblPr>
+        <w:tblW w:w="5000" w:type="pct"/>
+        <w:tblLayout w:type="fixed"/>
+        <w:tblLook w:val="0020" w:firstRow="1" w:lastRow="0" w:firstColumn="0" w:lastColumn="0" w:noHBand="0" w:noVBand="0"/>
+      </w:tblPr>
+      <w:tblGrid>
+        <w:gridCol w:w="4252"/>
+        <w:gridCol w:w="4252"/>
+      </w:tblGrid>
+      <w:tr>
+        <w:trPr>
+          <w:tblHeader/>
+        </w:trPr>
+        <w:tc>
+          <w:tcPr>
+            <w:tcW w:w="3960" w:type="dxa"/>
+          </w:tcPr>
+          <w:p>
+            <w:r>
+              <w:rPr>
+                <w:lang w:val="es"/>
+              </w:rPr>
+              <w:t>Campo</w:t>
+            </w:r>
+          </w:p>
+        </w:tc>
+        <w:tc>
+          <w:tcPr>
+            <w:tcW w:w="3960" w:type="dxa"/>
+          </w:tcPr>
+          <w:p>
+            <w:r>
+              <w:rPr>
+                <w:lang w:val="es"/>
+              </w:rPr>
+              <w:t>Descripción</w:t>
+            </w:r>
+          </w:p>
+        </w:tc>
+      </w:tr>
+      <w:tr>
+        <w:tc>
+          <w:tcPr>
+            <w:tcW w:w="3960" w:type="dxa"/>
+          </w:tcPr>
+          <w:p>
+            <w:r>
+              <w:rPr>
+                <w:lang w:val="es"/>
+              </w:rPr>
+              <w:t>Actor principal</w:t>
+            </w:r>
+          </w:p>
+        </w:tc>
+        <w:tc>
+          <w:tcPr>
+            <w:tcW w:w="3960" w:type="dxa"/>
+          </w:tcPr>
+          <w:p>
+            <w:r>
+              <w:rPr>
+                <w:lang w:val="es"/>
+              </w:rPr>
+              <w:t>Usuario</w:t>
+            </w:r>
+          </w:p>
+        </w:tc>
+      </w:tr>
+      <w:tr>
+        <w:tc>
+          <w:tcPr>
+            <w:tcW w:w="3960" w:type="dxa"/>
+          </w:tcPr>
+          <w:p>
+            <w:r>
+              <w:rPr>
+                <w:lang w:val="es"/>
+              </w:rPr>
+              <w:t>Propósito</w:t>
+            </w:r>
+          </w:p>
+        </w:tc>
+        <w:tc>
+          <w:tcPr>
+            <w:tcW w:w="3960" w:type="dxa"/>
+          </w:tcPr>
+          <w:p>
+            <w:r>
+              <w:rPr>
+                <w:lang w:val="es"/>
+              </w:rPr>
+              <w:t>Revocar en el servidor el token del cliente.</w:t>
+            </w:r>
+          </w:p>
+        </w:tc>
+      </w:tr>
+      <w:tr>
+        <w:tc>
+          <w:tcPr>
+            <w:tcW w:w="3960" w:type="dxa"/>
+          </w:tcPr>
+          <w:p>
+            <w:r>
+              <w:rPr>
+                <w:lang w:val="es"/>
+              </w:rPr>
+              <w:t>Disparador</w:t>
+            </w:r>
+          </w:p>
+        </w:tc>
+        <w:tc>
+          <w:tcPr>
+            <w:tcW w:w="3960" w:type="dxa"/>
+          </w:tcPr>
+          <w:p>
+            <w:r>
+              <w:rPr>
+                <w:lang w:val="es"/>
+              </w:rPr>
+              <w:t>El u</w:t>
+            </w:r>
+            <w:r>
+              <w:rPr>
+                <w:lang w:val="es"/>
+              </w:rPr>
+              <w:t>suario selecciona cerrar sesión o salir.</w:t>
+            </w:r>
+          </w:p>
+        </w:tc>
+      </w:tr>
+      <w:tr>
+        <w:tc>
+          <w:tcPr>
+            <w:tcW w:w="3960" w:type="dxa"/>
+          </w:tcPr>
+          <w:p>
+            <w:r>
+              <w:rPr>
+                <w:lang w:val="es"/>
+              </w:rPr>
+              <w:lastRenderedPageBreak/>
+              <w:t>Precondiciones</w:t>
+            </w:r>
+          </w:p>
+        </w:tc>
+        <w:tc>
+          <w:tcPr>
+            <w:tcW w:w="3960" w:type="dxa"/>
+          </w:tcPr>
+          <w:p>
+            <w:r>
+              <w:rPr>
+                <w:lang w:val="es"/>
+              </w:rPr>
+              <w:t>El cliente conserva el token de sesión.</w:t>
+            </w:r>
+          </w:p>
+        </w:tc>
+      </w:tr>
+      <w:tr>
+        <w:tc>
+          <w:tcPr>
+            <w:tcW w:w="3960" w:type="dxa"/>
+          </w:tcPr>
+          <w:p>
+            <w:r>
+              <w:rPr>
+                <w:lang w:val="es"/>
+              </w:rPr>
+              <w:t>Resultado</w:t>
+            </w:r>
+          </w:p>
+        </w:tc>
+        <w:tc>
+          <w:tcPr>
+            <w:tcW w:w="3960" w:type="dxa"/>
+          </w:tcPr>
+          <w:p>
+            <w:r>
+              <w:rPr>
+                <w:lang w:val="es"/>
+              </w:rPr>
+              <w:t>El servidor revoca el token; el cliente elimina su copia y vuelve al ingreso o termina.</w:t>
+            </w:r>
+          </w:p>
+        </w:tc>
+      </w:tr>
+    </w:tbl>
+    <w:p>
+      <w:pPr>
+        <w:pStyle w:val="Ttulo3"/>
+      </w:pPr>
+      <w:bookmarkStart w:id="46" w:name="_f56041d44d989a617f0381b5c459153f91a78f0"/>
+      <w:bookmarkStart w:id="47" w:name="_Toc244063282"/>
+      <w:r>
+        <w:rPr>
+          <w:lang w:val="es"/>
+        </w:rPr>
+        <w:t>5.6.1</w:t>
+      </w:r>
+      <w:r>
+        <w:tab/>
+      </w:r>
+      <w:r>
+        <w:rPr>
+          <w:lang w:val="es"/>
+        </w:rPr>
+        <w:t>Flujo principal</w:t>
+      </w:r>
+      <w:bookmarkEnd w:id="46"/>
+      <w:bookmarkEnd w:id="47"/>
+    </w:p>
+    <w:p>
+      <w:pPr>
+        <w:numPr>
+          <w:ilvl w:val="0"/>
+          <w:numId w:val="12"/>
+        </w:numPr>
+      </w:pPr>
+      <w:r>
+        <w:rPr>
+          <w:lang w:val="es"/>
+        </w:rPr>
+        <w:t>El usuario selecciona cerrar sesión.</w:t>
+      </w:r>
+    </w:p>
+    <w:p>
+      <w:pPr>
+        <w:numPr>
+          <w:ilvl w:val="0"/>
+          <w:numId w:val="12"/>
+        </w:numPr>
+      </w:pPr>
+      <w:r>
+        <w:rPr>
+          <w:lang w:val="es"/>
+        </w:rPr>
+        <w:t>El cliente invoca cerrarSesion con el token.</w:t>
+      </w:r>
+    </w:p>
+    <w:p>
+      <w:pPr>
+        <w:numPr>
+          <w:ilvl w:val="0"/>
+          <w:numId w:val="12"/>
+        </w:numPr>
+      </w:pPr>
+      <w:r>
+        <w:rPr>
+          <w:lang w:val="es"/>
+        </w:rPr>
+        <w:t>El servidor elimina la sesión de su memoria.</w:t>
+      </w:r>
+    </w:p>
+    <w:p>
+      <w:pPr>
+        <w:numPr>
+          <w:ilvl w:val="0"/>
+          <w:numId w:val="12"/>
+        </w:numPr>
+      </w:pPr>
+      <w:r>
+        <w:rPr>
+          <w:lang w:val="es"/>
+        </w:rPr>
+        <w:t>El cliente borra e</w:t>
+      </w:r>
+      <w:r>
+        <w:rPr>
+          <w:lang w:val="es"/>
+        </w:rPr>
+        <w:t>l token local y cierra el menú.</w:t>
+      </w:r>
+    </w:p>
+    <w:p>
+      <w:pPr>
+        <w:pStyle w:val="Ttulo3"/>
+      </w:pPr>
+      <w:bookmarkStart w:id="48" w:name="_30b17cfc0adc8cdd1390870a0dc447ccaf1c017"/>
+      <w:bookmarkStart w:id="49" w:name="_Toc244063283"/>
+      <w:r>
+        <w:rPr>
+          <w:lang w:val="es"/>
+        </w:rPr>
+        <w:t>5.6.2</w:t>
+      </w:r>
+      <w:r>
+        <w:tab/>
+      </w:r>
+      <w:r>
+        <w:rPr>
+          <w:lang w:val="es"/>
+        </w:rPr>
+        <w:t>Flujos alternativos y excepciones</w:t>
+      </w:r>
+      <w:bookmarkEnd w:id="48"/>
+      <w:bookmarkEnd w:id="49"/>
+    </w:p>
+    <w:p>
+      <w:pPr>
+        <w:numPr>
+          <w:ilvl w:val="0"/>
+          <w:numId w:val="13"/>
+        </w:numPr>
+      </w:pPr>
+      <w:r>
+        <w:rPr>
+          <w:b/>
+          <w:bCs/>
+          <w:lang w:val="es"/>
+        </w:rPr>
+        <w:t>A1 — Token ya vencido o inexistente:</w:t>
+      </w:r>
+      <w:r>
+        <w:rPr>
+          <w:lang w:val="es"/>
+        </w:rPr>
+        <w:t xml:space="preserve"> no existe sesión que revocar; el cliente elimina su copia local.</w:t>
+      </w:r>
+    </w:p>
+    <w:p>
+      <w:pPr>
+        <w:numPr>
+          <w:ilvl w:val="0"/>
+          <w:numId w:val="13"/>
+        </w:numPr>
+      </w:pPr>
+      <w:r>
+        <w:rPr>
+          <w:b/>
+          <w:bCs/>
+          <w:lang w:val="es"/>
+        </w:rPr>
+        <w:t>A2 — Falla de comunicación:</w:t>
+      </w:r>
+      <w:r>
+        <w:rPr>
+          <w:lang w:val="es"/>
+        </w:rPr>
+        <w:t xml:space="preserve"> el cliente limpia su estado local y solicita ingresar </w:t>
+      </w:r>
+      <w:r>
+        <w:rPr>
+          <w:lang w:val="es"/>
+        </w:rPr>
+        <w:t>nuevamente al próximo uso.</w:t>
+      </w:r>
+    </w:p>
+    <w:p>
+      <w:pPr>
+        <w:pStyle w:val="Ttulo2"/>
+      </w:pPr>
+      <w:bookmarkStart w:id="50" w:name="_4322009eddb45a9a865d6274dada7de61146cef"/>
+      <w:bookmarkStart w:id="51" w:name="_Toc244063284"/>
+      <w:r>
+        <w:rPr>
+          <w:lang w:val="es"/>
+        </w:rPr>
+        <w:t>5.7</w:t>
+      </w:r>
+      <w:r>
+        <w:tab/>
+      </w:r>
+      <w:r>
+        <w:rPr>
+          <w:lang w:val="es"/>
+        </w:rPr>
+        <w:t>Casos incluidos</w:t>
+      </w:r>
+      <w:bookmarkEnd w:id="50"/>
+      <w:bookmarkEnd w:id="51"/>
     </w:p>
     <w:tbl>
       <w:tblPr>
@@ -4936,7 +6460,7 @@
               <w:rPr>
                 <w:lang w:val="es"/>
               </w:rPr>
-              <w:t>CU-05</w:t>
+              <w:t>CU-07</w:t>
             </w:r>
           </w:p>
         </w:tc>
@@ -4962,7 +6486,7 @@
               <w:rPr>
                 <w:lang w:val="es"/>
               </w:rPr>
-              <w:t>Rechazar entradas vacías o fuera de los límites y comprobar la contraseña contra el hash almacenado.</w:t>
+              <w:t>Comprobar hash PBKDF2 y código de cliente asociado.</w:t>
             </w:r>
           </w:p>
         </w:tc>
@@ -4977,7 +6501,7 @@
               <w:rPr>
                 <w:lang w:val="es"/>
               </w:rPr>
-              <w:t>CU-06</w:t>
+              <w:t>CU-08</w:t>
             </w:r>
           </w:p>
         </w:tc>
@@ -5003,7 +6527,7 @@
               <w:rPr>
                 <w:lang w:val="es"/>
               </w:rPr>
-              <w:t>Rechazar la cuenta vacía o con más de ocho caracteres antes de consultar o depositar. La validación de solo dígitos existe en la interfaz Swing.</w:t>
+              <w:t>Las consultas y depósitos se limitan a cuentas ACTIVAS del cliente; el origen de transferencia debe pertenecer a este.</w:t>
             </w:r>
           </w:p>
         </w:tc>
@@ -5018,7 +6542,7 @@
               <w:rPr>
                 <w:lang w:val="es"/>
               </w:rPr>
-              <w:t>CU-07</w:t>
+              <w:t>CU-09</w:t>
             </w:r>
           </w:p>
         </w:tc>
@@ -5044,7 +6568,7 @@
               <w:rPr>
                 <w:lang w:val="es"/>
               </w:rPr>
-              <w:t>Exigir importe positivo, exacto a dos decimales y precisión máxima de doce dígitos.</w:t>
+              <w:t>Importe positivo, exacto a centavos y con precisión máxima de doce dígitos.</w:t>
             </w:r>
           </w:p>
         </w:tc>
@@ -5059,7 +6583,7 @@
               <w:rPr>
                 <w:lang w:val="es"/>
               </w:rPr>
-              <w:t>CU-08</w:t>
+              <w:t>CU-10</w:t>
             </w:r>
           </w:p>
         </w:tc>
@@ -5085,7 +6609,13 @@
               <w:rPr>
                 <w:lang w:val="es"/>
               </w:rPr>
-              <w:t>Confirmar actualización de saldo y alta del movimiento como una sola transacción; revertir si ocurre un error.</w:t>
+              <w:t>Act</w:t>
+            </w:r>
+            <w:r>
+              <w:rPr>
+                <w:lang w:val="es"/>
+              </w:rPr>
+              <w:t>ualizar cuenta e insertar movimiento tipo 003 y empleado 0001 de forma atómica.</w:t>
             </w:r>
           </w:p>
         </w:tc>
@@ -5095,13 +6625,12 @@
       <w:pPr>
         <w:pStyle w:val="Ttulo1"/>
       </w:pPr>
-      <w:bookmarkStart w:id="44" w:name="_trazabilidad"/>
-      <w:bookmarkStart w:id="45" w:name="_Toc243510809"/>
-      <w:r>
-        <w:rPr>
-          <w:lang w:val="es"/>
-        </w:rPr>
-        <w:lastRenderedPageBreak/>
+      <w:bookmarkStart w:id="52" w:name="_trazabilidad"/>
+      <w:bookmarkStart w:id="53" w:name="_Toc244063285"/>
+      <w:r>
+        <w:rPr>
+          <w:lang w:val="es"/>
+        </w:rPr>
         <w:t>6</w:t>
       </w:r>
       <w:r>
@@ -5113,14 +6642,14 @@
         </w:rPr>
         <w:t>Trazabilidad</w:t>
       </w:r>
-      <w:bookmarkEnd w:id="44"/>
-      <w:bookmarkEnd w:id="45"/>
+      <w:bookmarkEnd w:id="52"/>
+      <w:bookmarkEnd w:id="53"/>
     </w:p>
     <w:p>
       <w:pPr>
         <w:numPr>
           <w:ilvl w:val="0"/>
-          <w:numId w:val="9"/>
+          <w:numId w:val="14"/>
         </w:numPr>
       </w:pPr>
       <w:r>
@@ -5135,14 +6664,14 @@
         <w:rPr>
           <w:lang w:val="es"/>
         </w:rPr>
-        <w:t xml:space="preserve"> RF-01, RF-02 y RNF-01. Operación y componentes: login, autenticación DAO y clientes.</w:t>
+        <w:t xml:space="preserve"> RF-01 y RF-02; crearSesion, autenticación DAO y sesiones.</w:t>
       </w:r>
     </w:p>
     <w:p>
       <w:pPr>
         <w:numPr>
           <w:ilvl w:val="0"/>
-          <w:numId w:val="9"/>
+          <w:numId w:val="14"/>
         </w:numPr>
       </w:pPr>
       <w:r>
@@ -5151,20 +6680,26 @@
           <w:bCs/>
           <w:lang w:val="es"/>
         </w:rPr>
-        <w:t>CU-02 — Consultar movimientos:</w:t>
-      </w:r>
-      <w:r>
-        <w:rPr>
-          <w:lang w:val="es"/>
-        </w:rPr>
-        <w:t xml:space="preserve"> RF-03 y RF-08. Operación y módulo: traerMovimientos, consulta DAO.</w:t>
+        <w:t>CU-02 — Consultar cuentas:</w:t>
+      </w:r>
+      <w:r>
+        <w:rPr>
+          <w:lang w:val="es"/>
+        </w:rPr>
+        <w:t xml:space="preserve"> </w:t>
+      </w:r>
+      <w:r>
+        <w:rPr>
+          <w:lang w:val="es"/>
+        </w:rPr>
+        <w:t>RF-02 y RF-09; traerCuentas y consulta DAO.</w:t>
       </w:r>
     </w:p>
     <w:p>
       <w:pPr>
         <w:numPr>
           <w:ilvl w:val="0"/>
-          <w:numId w:val="9"/>
+          <w:numId w:val="14"/>
         </w:numPr>
       </w:pPr>
       <w:r>
@@ -5173,20 +6708,20 @@
           <w:bCs/>
           <w:lang w:val="es"/>
         </w:rPr>
-        <w:t>CU-03 — Registrar depósito:</w:t>
-      </w:r>
-      <w:r>
-        <w:rPr>
-          <w:lang w:val="es"/>
-        </w:rPr>
-        <w:t xml:space="preserve"> RF-04, RF-05, RF-06, RF-07, RF-08, RNF-03 y RNF-04. Operación y módulo: regDeposito, transacción DAO.</w:t>
+        <w:t>CU-03 — Consultar movimientos:</w:t>
+      </w:r>
+      <w:r>
+        <w:rPr>
+          <w:lang w:val="es"/>
+        </w:rPr>
+        <w:t xml:space="preserve"> RF-02, RF-03 y RF-09; traerMovimientos y consulta DAO.</w:t>
       </w:r>
     </w:p>
     <w:p>
       <w:pPr>
         <w:numPr>
           <w:ilvl w:val="0"/>
-          <w:numId w:val="9"/>
+          <w:numId w:val="14"/>
         </w:numPr>
       </w:pPr>
       <w:r>
@@ -5195,107 +6730,184 @@
           <w:bCs/>
           <w:lang w:val="es"/>
         </w:rPr>
-        <w:t>CU-04 — Cerrar sesión local:</w:t>
-      </w:r>
-      <w:r>
-        <w:rPr>
-          <w:lang w:val="es"/>
-        </w:rPr>
-        <w:t xml:space="preserve"> RF-09. Componentes: menú de consola y controlador Swing.</w:t>
-      </w:r>
-    </w:p>
-    <w:p>
-      <w:pPr>
-        <w:pStyle w:val="Ttulo1"/>
-      </w:pPr>
-      <w:bookmarkStart w:id="46" w:name="_6b82f6bfa81b62325f38e422bc72e934ce4f297"/>
-      <w:bookmarkStart w:id="47" w:name="_Toc243510810"/>
-      <w:r>
-        <w:rPr>
-          <w:lang w:val="es"/>
-        </w:rPr>
-        <w:t>7</w:t>
-      </w:r>
-      <w:r>
-        <w:tab/>
-      </w:r>
-      <w:r>
-        <w:rPr>
-          <w:lang w:val="es"/>
-        </w:rPr>
-        <w:t>Observaciones de fidelidad</w:t>
-      </w:r>
-      <w:bookmarkEnd w:id="46"/>
-      <w:bookmarkEnd w:id="47"/>
+        <w:t>CU-04 — Registrar depósito:</w:t>
+      </w:r>
+      <w:r>
+        <w:rPr>
+          <w:lang w:val="es"/>
+        </w:rPr>
+        <w:t xml:space="preserve"> RF-02, RF-04 a RF-07 y RF-09; regDeposito y transacción DAO.</w:t>
+      </w:r>
     </w:p>
     <w:p>
       <w:pPr>
         <w:numPr>
           <w:ilvl w:val="0"/>
-          <w:numId w:val="10"/>
+          <w:numId w:val="14"/>
         </w:numPr>
       </w:pPr>
       <w:r>
         <w:rPr>
-          <w:lang w:val="es"/>
-        </w:rPr>
-        <w:t>El resultado positivo de login habilita el flujo de los clientes, pero el servicio no crea una sesión, no devuelve token y no exige dicho resultado en las llamadas de consulta o depósito.</w:t>
+          <w:b/>
+          <w:bCs/>
+          <w:lang w:val="es"/>
+        </w:rPr>
+        <w:lastRenderedPageBreak/>
+        <w:t>CU-05 — Transferir fondos:</w:t>
+      </w:r>
+      <w:r>
+        <w:rPr>
+          <w:lang w:val="es"/>
+        </w:rPr>
+        <w:t xml:space="preserve"> RF-02, RF-</w:t>
+      </w:r>
+      <w:r>
+        <w:rPr>
+          <w:lang w:val="es"/>
+        </w:rPr>
+        <w:t>08 y RF-09; transferir, validación, idempotencia y transacción DAO.</w:t>
       </w:r>
     </w:p>
     <w:p>
       <w:pPr>
         <w:numPr>
           <w:ilvl w:val="0"/>
-          <w:numId w:val="10"/>
+          <w:numId w:val="14"/>
         </w:numPr>
       </w:pPr>
       <w:r>
         <w:rPr>
-          <w:lang w:val="es"/>
-        </w:rPr>
-        <w:t>El cierre de sesión descrito es local. No hay operación SOAP para revocar una sesión.</w:t>
-      </w:r>
+          <w:b/>
+          <w:bCs/>
+          <w:lang w:val="es"/>
+        </w:rPr>
+        <w:t>CU-06 — Cerrar sesión:</w:t>
+      </w:r>
+      <w:r>
+        <w:rPr>
+          <w:lang w:val="es"/>
+        </w:rPr>
+        <w:t xml:space="preserve"> RF-09 y RF-10; cerrarSesion y controladores de los clientes.</w:t>
+      </w:r>
+    </w:p>
+    <w:p>
+      <w:pPr>
+        <w:pStyle w:val="Ttulo1"/>
+      </w:pPr>
+      <w:bookmarkStart w:id="54" w:name="_6b82f6bfa81b62325f38e422bc72e934ce4f297"/>
+      <w:bookmarkStart w:id="55" w:name="_Toc244063286"/>
+      <w:r>
+        <w:rPr>
+          <w:lang w:val="es"/>
+        </w:rPr>
+        <w:t>7</w:t>
+      </w:r>
+      <w:r>
+        <w:tab/>
+      </w:r>
+      <w:r>
+        <w:rPr>
+          <w:lang w:val="es"/>
+        </w:rPr>
+        <w:t>Observaciones de fidelidad</w:t>
+      </w:r>
+      <w:bookmarkEnd w:id="54"/>
+      <w:bookmarkEnd w:id="55"/>
     </w:p>
     <w:p>
       <w:pPr>
         <w:numPr>
           <w:ilvl w:val="0"/>
-          <w:numId w:val="10"/>
+          <w:numId w:val="15"/>
         </w:numPr>
       </w:pPr>
       <w:r>
         <w:rPr>
           <w:lang w:val="es"/>
         </w:rPr>
-        <w:t>La operación de depósito registra al empleado 0001 configurado en el código del servidor; no registra la identidad del operador que inició sesión.</w:t>
+        <w:t>Los clientes de consola, escritorio, Android y web consumen operaciones SOA</w:t>
+      </w:r>
+      <w:r>
+        <w:rPr>
+          <w:lang w:val="es"/>
+        </w:rPr>
+        <w:t>P y utilizan el token creado por crearSesion.</w:t>
       </w:r>
     </w:p>
     <w:p>
       <w:pPr>
         <w:numPr>
           <w:ilvl w:val="0"/>
-          <w:numId w:val="10"/>
+          <w:numId w:val="15"/>
         </w:numPr>
       </w:pPr>
       <w:r>
         <w:rPr>
           <w:lang w:val="es"/>
         </w:rPr>
-        <w:t>Los errores de consulta se representan como excepción SOAP; los errores de login y depósito se exponen como -1.</w:t>
+        <w:t>login es una operación de compatibilidad: valida credenciales con 1/-1, pero no crea una sesión.</w:t>
       </w:r>
     </w:p>
     <w:p>
       <w:pPr>
         <w:numPr>
           <w:ilvl w:val="0"/>
-          <w:numId w:val="10"/>
+          <w:numId w:val="15"/>
         </w:numPr>
       </w:pPr>
       <w:r>
         <w:rPr>
           <w:lang w:val="es"/>
         </w:rPr>
-        <w:t>No se modelan funciones de web, móvil, transferencias ni administración porque no están implementadas en el alcance revisado.</w:t>
+        <w:t>El token se conserva en memoria del servidor, vence a los 20 minutos y se revoca al cerrar sesión; el reinicio del servidor invalida las sesiones.</w:t>
+      </w:r>
+    </w:p>
+    <w:p>
+      <w:pPr>
+        <w:numPr>
+          <w:ilvl w:val="0"/>
+          <w:numId w:val="15"/>
+        </w:numPr>
+      </w:pPr>
+      <w:r>
+        <w:rPr>
+          <w:lang w:val="es"/>
+        </w:rPr>
+        <w:t>El depósito usa el empleado fijo 0001 y no implementa idempotencia.</w:t>
+      </w:r>
+    </w:p>
+    <w:p>
+      <w:pPr>
+        <w:numPr>
+          <w:ilvl w:val="0"/>
+          <w:numId w:val="15"/>
+        </w:numPr>
+      </w:pPr>
+      <w:r>
+        <w:rPr>
+          <w:lang w:val="es"/>
+        </w:rPr>
+        <w:t>La transferencia es idempotente por usuar</w:t>
+      </w:r>
+      <w:r>
+        <w:rPr>
+          <w:lang w:val="es"/>
+        </w:rPr>
+        <w:t>io y clave UUID cuando se repiten los mismos datos; los datos diferentes se rechazan.</w:t>
+      </w:r>
+    </w:p>
+    <w:p>
+      <w:pPr>
+        <w:numPr>
+          <w:ilvl w:val="0"/>
+          <w:numId w:val="15"/>
+        </w:numPr>
+      </w:pPr>
+      <w:r>
+        <w:rPr>
+          <w:lang w:val="es"/>
+        </w:rPr>
+        <w:t>Las consultas SOAP pueden devolver lista vacía para cuenta sin movimientos o no accesible; los errores de sesión y comunicación deben mostrarse por separado.</w:t>
       </w:r>
     </w:p>
     <w:sectPr>
@@ -5418,7 +7030,7 @@
   <w:abstractNum w:abstractNumId="0" w15:restartNumberingAfterBreak="0">
     <w:nsid w:val="0000A991"/>
     <w:multiLevelType w:val="multilevel"/>
-    <w:tmpl w:val="7F2E85E8"/>
+    <w:tmpl w:val="51A0F106"/>
     <w:lvl w:ilvl="0">
       <w:numFmt w:val="bullet"/>
       <w:lvlText w:val=""/>
@@ -5522,7 +7134,7 @@
   <w:abstractNum w:abstractNumId="1" w15:restartNumberingAfterBreak="0">
     <w:nsid w:val="00A99411"/>
     <w:multiLevelType w:val="multilevel"/>
-    <w:tmpl w:val="8AAC7AF8"/>
+    <w:tmpl w:val="28D623AA"/>
     <w:lvl w:ilvl="0">
       <w:start w:val="1"/>
       <w:numFmt w:val="decimal"/>
@@ -5741,9 +7353,78 @@
     <w:abstractNumId w:val="0"/>
   </w:num>
   <w:num w:numId="10">
+    <w:abstractNumId w:val="1"/>
+    <w:lvlOverride w:ilvl="0">
+      <w:startOverride w:val="1"/>
+    </w:lvlOverride>
+    <w:lvlOverride w:ilvl="1">
+      <w:startOverride w:val="1"/>
+    </w:lvlOverride>
+    <w:lvlOverride w:ilvl="2">
+      <w:startOverride w:val="1"/>
+    </w:lvlOverride>
+    <w:lvlOverride w:ilvl="3">
+      <w:startOverride w:val="1"/>
+    </w:lvlOverride>
+    <w:lvlOverride w:ilvl="4">
+      <w:startOverride w:val="1"/>
+    </w:lvlOverride>
+    <w:lvlOverride w:ilvl="5">
+      <w:startOverride w:val="1"/>
+    </w:lvlOverride>
+    <w:lvlOverride w:ilvl="6">
+      <w:startOverride w:val="1"/>
+    </w:lvlOverride>
+    <w:lvlOverride w:ilvl="7">
+      <w:startOverride w:val="1"/>
+    </w:lvlOverride>
+    <w:lvlOverride w:ilvl="8">
+      <w:startOverride w:val="1"/>
+    </w:lvlOverride>
+  </w:num>
+  <w:num w:numId="11">
     <w:abstractNumId w:val="0"/>
   </w:num>
-  <w:numIdMacAtCleanup w:val="10"/>
+  <w:num w:numId="12">
+    <w:abstractNumId w:val="1"/>
+    <w:lvlOverride w:ilvl="0">
+      <w:startOverride w:val="1"/>
+    </w:lvlOverride>
+    <w:lvlOverride w:ilvl="1">
+      <w:startOverride w:val="1"/>
+    </w:lvlOverride>
+    <w:lvlOverride w:ilvl="2">
+      <w:startOverride w:val="1"/>
+    </w:lvlOverride>
+    <w:lvlOverride w:ilvl="3">
+      <w:startOverride w:val="1"/>
+    </w:lvlOverride>
+    <w:lvlOverride w:ilvl="4">
+      <w:startOverride w:val="1"/>
+    </w:lvlOverride>
+    <w:lvlOverride w:ilvl="5">
+      <w:startOverride w:val="1"/>
+    </w:lvlOverride>
+    <w:lvlOverride w:ilvl="6">
+      <w:startOverride w:val="1"/>
+    </w:lvlOverride>
+    <w:lvlOverride w:ilvl="7">
+      <w:startOverride w:val="1"/>
+    </w:lvlOverride>
+    <w:lvlOverride w:ilvl="8">
+      <w:startOverride w:val="1"/>
+    </w:lvlOverride>
+  </w:num>
+  <w:num w:numId="13">
+    <w:abstractNumId w:val="0"/>
+  </w:num>
+  <w:num w:numId="14">
+    <w:abstractNumId w:val="0"/>
+  </w:num>
+  <w:num w:numId="15">
+    <w:abstractNumId w:val="0"/>
+  </w:num>
+  <w:numIdMacAtCleanup w:val="15"/>
 </w:numbering>
 </file>
 

</xml_diff>